<commit_message>
Add team handwritten AI and third-party tools declaration
</commit_message>
<xml_diff>
--- a/docs/人工智能及第三方工具使用说明.docx
+++ b/docs/人工智能及第三方工具使用说明.docx
@@ -4,1782 +4,139 @@
   <w:body>
     <w:p>
       <w:pPr>
-        <w:pStyle w:val="1"/>
-        <w:jc w:val="center"/>
-        <w:rPr>
-          <w:rFonts w:ascii="Calibri" w:hAnsi="Calibri" w:hint="eastAsia"/>
-          <w:color w:val="C00000"/>
-          <w:sz w:val="24"/>
-          <w:szCs w:val="36"/>
-        </w:rPr>
+        <w:spacing w:after="200"/>
       </w:pPr>
       <w:r>
         <w:rPr>
-          <w:rFonts w:ascii="Calibri" w:hAnsi="Calibri" w:hint="eastAsia"/>
-          <w:color w:val="C00000"/>
-          <w:sz w:val="24"/>
-          <w:szCs w:val="36"/>
-        </w:rPr>
-        <w:t>待亲笔手抄并扫描：本稿尚未完成手抄团队声明，不能作为已签署正式提交版。</w:t>
+          <w:noProof/>
+        </w:rPr>
+        <w:drawing>
+          <wp:anchor distT="0" distB="0" distL="114300" distR="114300" simplePos="0" relativeHeight="251659264" behindDoc="0" locked="0" layoutInCell="1" allowOverlap="1" wp14:anchorId="353E3AF7" wp14:editId="2F68F26B">
+            <wp:simplePos x="0" y="0"/>
+            <wp:positionH relativeFrom="column">
+              <wp:posOffset>70485</wp:posOffset>
+            </wp:positionH>
+            <wp:positionV relativeFrom="paragraph">
+              <wp:posOffset>441325</wp:posOffset>
+            </wp:positionV>
+            <wp:extent cx="5266690" cy="7398385"/>
+            <wp:effectExtent l="0" t="0" r="10160" b="12065"/>
+            <wp:wrapSquare wrapText="bothSides"/>
+            <wp:docPr id="3" name="图片 3" descr="4c2ccf51d7983219bc35d7a6c0a4e358"/>
+            <wp:cNvGraphicFramePr>
+              <a:graphicFrameLocks xmlns:a="http://schemas.openxmlformats.org/drawingml/2006/main" noChangeAspect="1"/>
+            </wp:cNvGraphicFramePr>
+            <a:graphic xmlns:a="http://schemas.openxmlformats.org/drawingml/2006/main">
+              <a:graphicData uri="http://schemas.openxmlformats.org/drawingml/2006/picture">
+                <pic:pic xmlns:pic="http://schemas.openxmlformats.org/drawingml/2006/picture">
+                  <pic:nvPicPr>
+                    <pic:cNvPr id="3" name="图片 3" descr="4c2ccf51d7983219bc35d7a6c0a4e358"/>
+                    <pic:cNvPicPr>
+                      <a:picLocks noChangeAspect="1"/>
+                    </pic:cNvPicPr>
+                  </pic:nvPicPr>
+                  <pic:blipFill>
+                    <a:blip r:embed="rId6"/>
+                    <a:stretch>
+                      <a:fillRect/>
+                    </a:stretch>
+                  </pic:blipFill>
+                  <pic:spPr>
+                    <a:xfrm>
+                      <a:off x="0" y="0"/>
+                      <a:ext cx="5266690" cy="7398385"/>
+                    </a:xfrm>
+                    <a:prstGeom prst="rect">
+                      <a:avLst/>
+                    </a:prstGeom>
+                  </pic:spPr>
+                </pic:pic>
+              </a:graphicData>
+            </a:graphic>
+          </wp:anchor>
+        </w:drawing>
+      </w:r>
+      <w:r>
+        <w:br w:type="page"/>
+      </w:r>
+    </w:p>
+    <w:p>
+      <w:pPr>
+        <w:pStyle w:val="a7"/>
+      </w:pPr>
+      <w:r>
+        <w:rPr>
+          <w:rFonts w:hint="eastAsia"/>
+        </w:rPr>
+        <w:lastRenderedPageBreak/>
+        <w:t>附录：工具使用、第三方来源与复核边界</w:t>
       </w:r>
     </w:p>
     <w:p>
       <w:pPr>
         <w:pStyle w:val="1"/>
-        <w:jc w:val="center"/>
-        <w:rPr>
-          <w:sz w:val="40"/>
-          <w:szCs w:val="36"/>
-        </w:rPr>
       </w:pPr>
       <w:r>
         <w:rPr>
-          <w:rFonts w:ascii="Calibri" w:hAnsi="Calibri"/>
-          <w:color w:val="202020"/>
-          <w:sz w:val="40"/>
-          <w:szCs w:val="36"/>
-        </w:rPr>
-        <w:t>人工智能及第三方工具使用声明</w:t>
+          <w:rFonts w:hint="eastAsia"/>
+        </w:rPr>
+        <w:t>工具或服务名称及主要使用阶段</w:t>
       </w:r>
     </w:p>
     <w:p>
-      <w:pPr>
-        <w:rPr>
-          <w:rFonts w:hint="eastAsia"/>
-          <w:color w:val="202020"/>
-          <w:sz w:val="22"/>
-          <w:lang w:eastAsia="zh-CN"/>
-        </w:rPr>
-      </w:pPr>
-      <w:r>
-        <w:rPr>
-          <w:rFonts w:hint="eastAsia"/>
-          <w:color w:val="202020"/>
-          <w:sz w:val="22"/>
-          <w:lang w:eastAsia="zh-CN"/>
-        </w:rPr>
-        <w:t>队伍名称：操作系统创新小分队</w:t>
-      </w:r>
-    </w:p>
-    <w:p>
-      <w:r>
-        <w:rPr>
-          <w:rFonts w:hint="eastAsia"/>
-          <w:color w:val="202020"/>
-          <w:sz w:val="22"/>
-          <w:lang w:eastAsia="zh-CN"/>
-        </w:rPr>
-        <w:t>项目名称：基于深度强化学习的云—边—端异构计算资源管理调度方法</w:t>
-      </w:r>
-    </w:p>
-    <w:p>
-      <w:r>
-        <w:rPr>
-          <w:rFonts w:ascii="Calibri" w:hAnsi="Calibri" w:hint="eastAsia"/>
-          <w:color w:val="202020"/>
-          <w:sz w:val="22"/>
-        </w:rPr>
-        <w:t>赛题：第</w:t>
-      </w:r>
-      <w:r>
-        <w:rPr>
-          <w:rFonts w:ascii="Calibri" w:hAnsi="Calibri" w:hint="eastAsia"/>
-          <w:color w:val="202020"/>
-          <w:sz w:val="22"/>
-        </w:rPr>
-        <w:t>16</w:t>
-      </w:r>
-      <w:r>
-        <w:rPr>
-          <w:rFonts w:ascii="Calibri" w:hAnsi="Calibri" w:hint="eastAsia"/>
-          <w:color w:val="202020"/>
-          <w:sz w:val="22"/>
-        </w:rPr>
-        <w:t>题</w:t>
-      </w:r>
-    </w:p>
-    <w:p>
-      <w:r>
-        <w:rPr>
-          <w:rFonts w:ascii="Calibri" w:hAnsi="Calibri"/>
-          <w:color w:val="202020"/>
-          <w:sz w:val="22"/>
-        </w:rPr>
-        <w:t>说明：工具使用本身不构成加分或扣分依据。请如实、简要说明主要使用环节及人工验证责任，不需要提交全部提示词、完整对话或估算</w:t>
-      </w:r>
-      <w:r>
-        <w:rPr>
-          <w:rFonts w:ascii="Calibri" w:hAnsi="Calibri"/>
-          <w:color w:val="202020"/>
-          <w:sz w:val="22"/>
+      <w:r>
+        <w:rPr>
+          <w:rFonts w:hint="eastAsia"/>
+        </w:rPr>
+        <w:t>团队确认：除本次</w:t>
+      </w:r>
+      <w:r>
+        <w:rPr>
+          <w:rFonts w:hint="eastAsia"/>
+        </w:rPr>
+        <w:t>Codex</w:t>
+      </w:r>
+      <w:r>
+        <w:rPr>
+          <w:rFonts w:hint="eastAsia"/>
+        </w:rPr>
+        <w:t>外，没有使用其他生成式人工智能工具。</w:t>
+      </w:r>
+      <w:r>
+        <w:rPr>
+          <w:rFonts w:hint="eastAsia"/>
+        </w:rPr>
+        <w:t>Codex</w:t>
+      </w:r>
+      <w:r>
+        <w:rPr>
+          <w:rFonts w:hint="eastAsia"/>
+        </w:rPr>
+        <w:t>在本轮用于资料检索、提交规范与方案讨论、文稿重组、代码路径重构和运行入口适配、测试与证据核对、</w:t>
+      </w:r>
+      <w:r>
+        <w:rPr>
+          <w:rFonts w:hint="eastAsia"/>
+        </w:rPr>
+        <w:t>PPT</w:t>
+      </w:r>
+      <w:r>
+        <w:rPr>
+          <w:rFonts w:hint="eastAsia"/>
+        </w:rPr>
+        <w:t>及演示材料整理和匿名化检查。其输出均属于辅助建议或自动化操作结果，不能代替参赛成员对最终作品的责任。未填写未经记录的模型型号或</w:t>
+      </w:r>
+      <w:r>
+        <w:rPr>
+          <w:rFonts w:hint="eastAsia"/>
         </w:rPr>
         <w:t>AI</w:t>
       </w:r>
       <w:r>
         <w:rPr>
-          <w:rFonts w:ascii="Calibri" w:hAnsi="Calibri"/>
-          <w:color w:val="202020"/>
-          <w:sz w:val="22"/>
+          <w:rFonts w:hint="eastAsia"/>
         </w:rPr>
         <w:t>生成代码比例。</w:t>
-      </w:r>
-    </w:p>
-    <w:tbl>
-      <w:tblPr>
-        <w:tblStyle w:val="a3"/>
-        <w:tblW w:w="5610" w:type="pct"/>
-        <w:tblInd w:w="-391" w:type="dxa"/>
-        <w:tblLook w:val="04A0" w:firstRow="1" w:lastRow="0" w:firstColumn="1" w:lastColumn="0" w:noHBand="0" w:noVBand="1"/>
-      </w:tblPr>
-      <w:tblGrid>
-        <w:gridCol w:w="1707"/>
-        <w:gridCol w:w="3914"/>
-        <w:gridCol w:w="3968"/>
-      </w:tblGrid>
-      <w:tr>
-        <w:trPr>
-          <w:cantSplit/>
-          <w:tblHeader/>
-        </w:trPr>
-        <w:tc>
-          <w:tcPr>
-            <w:tcW w:w="890" w:type="pct"/>
-            <w:shd w:val="clear" w:color="auto" w:fill="F2F4F7"/>
-            <w:tcMar>
-              <w:top w:w="80" w:type="dxa"/>
-              <w:left w:w="120" w:type="dxa"/>
-              <w:bottom w:w="80" w:type="dxa"/>
-              <w:right w:w="120" w:type="dxa"/>
-            </w:tcMar>
-            <w:vAlign w:val="center"/>
-          </w:tcPr>
-          <w:p>
-            <w:pPr>
-              <w:keepLines/>
-              <w:spacing w:after="0" w:line="280" w:lineRule="exact"/>
-              <w:ind w:firstLine="0"/>
-              <w:jc w:val="center"/>
-              <w:rPr>
-                <w:sz w:val="21"/>
-              </w:rPr>
-            </w:pPr>
-            <w:r>
-              <w:rPr>
-                <w:rFonts w:ascii="Calibri" w:eastAsia="黑体" w:hAnsi="Calibri"/>
-                <w:b/>
-                <w:color w:val="202020"/>
-                <w:sz w:val="21"/>
-              </w:rPr>
-              <w:t>项目</w:t>
-            </w:r>
-          </w:p>
-        </w:tc>
-        <w:tc>
-          <w:tcPr>
-            <w:tcW w:w="2041" w:type="pct"/>
-            <w:shd w:val="clear" w:color="auto" w:fill="F2F4F7"/>
-            <w:tcMar>
-              <w:top w:w="80" w:type="dxa"/>
-              <w:left w:w="120" w:type="dxa"/>
-              <w:bottom w:w="80" w:type="dxa"/>
-              <w:right w:w="120" w:type="dxa"/>
-            </w:tcMar>
-            <w:vAlign w:val="center"/>
-          </w:tcPr>
-          <w:p>
-            <w:pPr>
-              <w:keepLines/>
-              <w:spacing w:after="0" w:line="280" w:lineRule="exact"/>
-              <w:ind w:firstLine="0"/>
-              <w:jc w:val="center"/>
-              <w:rPr>
-                <w:sz w:val="21"/>
-              </w:rPr>
-            </w:pPr>
-            <w:r>
-              <w:rPr>
-                <w:rFonts w:ascii="Calibri" w:eastAsia="黑体" w:hAnsi="Calibri"/>
-                <w:b/>
-                <w:color w:val="202020"/>
-                <w:sz w:val="21"/>
-              </w:rPr>
-              <w:t>填写说明</w:t>
-            </w:r>
-          </w:p>
-        </w:tc>
-        <w:tc>
-          <w:tcPr>
-            <w:tcW w:w="2069" w:type="pct"/>
-            <w:shd w:val="clear" w:color="auto" w:fill="F2F4F7"/>
-            <w:tcMar>
-              <w:top w:w="80" w:type="dxa"/>
-              <w:left w:w="120" w:type="dxa"/>
-              <w:bottom w:w="80" w:type="dxa"/>
-              <w:right w:w="120" w:type="dxa"/>
-            </w:tcMar>
-            <w:vAlign w:val="center"/>
-          </w:tcPr>
-          <w:p>
-            <w:pPr>
-              <w:keepLines/>
-              <w:spacing w:after="0" w:line="280" w:lineRule="exact"/>
-              <w:ind w:firstLine="0"/>
-              <w:jc w:val="center"/>
-              <w:rPr>
-                <w:sz w:val="21"/>
-              </w:rPr>
-            </w:pPr>
-            <w:r>
-              <w:rPr>
-                <w:rFonts w:ascii="Calibri" w:eastAsia="黑体" w:hAnsi="Calibri"/>
-                <w:b/>
-                <w:color w:val="202020"/>
-                <w:sz w:val="21"/>
-              </w:rPr>
-              <w:t>参赛队填写</w:t>
-            </w:r>
-          </w:p>
-        </w:tc>
-      </w:tr>
-      <w:tr>
-        <w:trPr>
-          <w:cantSplit/>
-          <w:trHeight w:val="907"/>
-        </w:trPr>
-        <w:tc>
-          <w:tcPr>
-            <w:tcW w:w="890" w:type="pct"/>
-            <w:tcMar>
-              <w:top w:w="80" w:type="dxa"/>
-              <w:left w:w="120" w:type="dxa"/>
-              <w:bottom w:w="80" w:type="dxa"/>
-              <w:right w:w="120" w:type="dxa"/>
-            </w:tcMar>
-            <w:vAlign w:val="center"/>
-          </w:tcPr>
-          <w:p>
-            <w:pPr>
-              <w:keepLines/>
-              <w:spacing w:after="0" w:line="280" w:lineRule="exact"/>
-              <w:ind w:firstLine="0"/>
-              <w:jc w:val="center"/>
-              <w:rPr>
-                <w:rFonts w:eastAsia="黑体"/>
-                <w:b/>
-                <w:sz w:val="21"/>
-                <w:szCs w:val="32"/>
-              </w:rPr>
-            </w:pPr>
-            <w:r>
-              <w:rPr>
-                <w:rFonts w:ascii="Calibri" w:eastAsia="黑体" w:hAnsi="Calibri"/>
-                <w:b/>
-                <w:color w:val="202020"/>
-                <w:sz w:val="21"/>
-                <w:szCs w:val="32"/>
-              </w:rPr>
-              <w:t>工具</w:t>
-            </w:r>
-          </w:p>
-          <w:p>
-            <w:pPr>
-              <w:keepLines/>
-              <w:spacing w:after="0" w:line="280" w:lineRule="exact"/>
-              <w:ind w:firstLine="0"/>
-              <w:jc w:val="center"/>
-              <w:rPr>
-                <w:sz w:val="21"/>
-                <w:szCs w:val="32"/>
-              </w:rPr>
-            </w:pPr>
-            <w:r>
-              <w:rPr>
-                <w:rFonts w:ascii="Calibri" w:eastAsia="黑体" w:hAnsi="Calibri"/>
-                <w:b/>
-                <w:color w:val="202020"/>
-                <w:sz w:val="21"/>
-                <w:szCs w:val="32"/>
-              </w:rPr>
-              <w:t>或服务名称</w:t>
-            </w:r>
-          </w:p>
-        </w:tc>
-        <w:tc>
-          <w:tcPr>
-            <w:tcW w:w="2041" w:type="pct"/>
-            <w:tcMar>
-              <w:top w:w="80" w:type="dxa"/>
-              <w:left w:w="120" w:type="dxa"/>
-              <w:bottom w:w="80" w:type="dxa"/>
-              <w:right w:w="120" w:type="dxa"/>
-            </w:tcMar>
-            <w:vAlign w:val="center"/>
-          </w:tcPr>
-          <w:p>
-            <w:pPr>
-              <w:keepLines/>
-              <w:spacing w:after="0" w:line="280" w:lineRule="exact"/>
-              <w:ind w:firstLine="0"/>
-              <w:rPr>
-                <w:sz w:val="21"/>
-                <w:szCs w:val="32"/>
-              </w:rPr>
-            </w:pPr>
-            <w:r>
-              <w:rPr>
-                <w:rFonts w:ascii="Calibri" w:hAnsi="Calibri"/>
-                <w:color w:val="202020"/>
-                <w:sz w:val="21"/>
-                <w:szCs w:val="32"/>
-              </w:rPr>
-              <w:t>例如：代码补全、生成式</w:t>
-            </w:r>
-            <w:r>
-              <w:rPr>
-                <w:rFonts w:ascii="Calibri" w:hAnsi="Calibri"/>
-                <w:color w:val="202020"/>
-                <w:sz w:val="21"/>
-                <w:szCs w:val="32"/>
-              </w:rPr>
-              <w:t>AI</w:t>
-            </w:r>
-            <w:r>
-              <w:rPr>
-                <w:rFonts w:ascii="Calibri" w:hAnsi="Calibri"/>
-                <w:color w:val="202020"/>
-                <w:sz w:val="21"/>
-                <w:szCs w:val="32"/>
-              </w:rPr>
-              <w:t>、检索、静态分析、测试或文档工具。</w:t>
-            </w:r>
-          </w:p>
-        </w:tc>
-        <w:tc>
-          <w:tcPr>
-            <w:tcW w:w="2069" w:type="pct"/>
-            <w:tcMar>
-              <w:top w:w="80" w:type="dxa"/>
-              <w:left w:w="120" w:type="dxa"/>
-              <w:bottom w:w="80" w:type="dxa"/>
-              <w:right w:w="120" w:type="dxa"/>
-            </w:tcMar>
-            <w:vAlign w:val="center"/>
-          </w:tcPr>
-          <w:p>
-            <w:pPr>
-              <w:keepLines/>
-              <w:spacing w:after="0" w:line="280" w:lineRule="exact"/>
-              <w:ind w:firstLine="0"/>
-              <w:rPr>
-                <w:sz w:val="21"/>
-                <w:szCs w:val="32"/>
-              </w:rPr>
-            </w:pPr>
-            <w:r>
-              <w:rPr>
-                <w:rFonts w:hint="eastAsia"/>
-                <w:sz w:val="21"/>
-                <w:szCs w:val="32"/>
-              </w:rPr>
-              <w:t>生成式</w:t>
-            </w:r>
-            <w:r>
-              <w:rPr>
-                <w:rFonts w:hint="eastAsia"/>
-                <w:sz w:val="21"/>
-                <w:szCs w:val="32"/>
-              </w:rPr>
-              <w:t>AI</w:t>
-            </w:r>
-            <w:r>
-              <w:rPr>
-                <w:rFonts w:hint="eastAsia"/>
-                <w:sz w:val="21"/>
-                <w:szCs w:val="32"/>
-              </w:rPr>
-              <w:t>：仅本次</w:t>
-            </w:r>
-            <w:r>
-              <w:rPr>
-                <w:rFonts w:hint="eastAsia"/>
-                <w:sz w:val="21"/>
-                <w:szCs w:val="32"/>
-              </w:rPr>
-              <w:t>Codex</w:t>
-            </w:r>
-            <w:r>
-              <w:rPr>
-                <w:rFonts w:hint="eastAsia"/>
-                <w:sz w:val="21"/>
-                <w:szCs w:val="32"/>
-              </w:rPr>
-              <w:t>（团队确认）。第三方辅助：</w:t>
-            </w:r>
-            <w:r>
-              <w:rPr>
-                <w:rFonts w:hint="eastAsia"/>
-                <w:sz w:val="21"/>
-                <w:szCs w:val="32"/>
-              </w:rPr>
-              <w:t>Python</w:t>
-            </w:r>
-            <w:r>
-              <w:rPr>
-                <w:rFonts w:hint="eastAsia"/>
-                <w:sz w:val="21"/>
-                <w:szCs w:val="32"/>
-              </w:rPr>
-              <w:t>、</w:t>
-            </w:r>
-            <w:r>
-              <w:rPr>
-                <w:rFonts w:hint="eastAsia"/>
-                <w:sz w:val="21"/>
-                <w:szCs w:val="32"/>
-              </w:rPr>
-              <w:t>pytest</w:t>
-            </w:r>
-            <w:r>
-              <w:rPr>
-                <w:rFonts w:hint="eastAsia"/>
-                <w:sz w:val="21"/>
-                <w:szCs w:val="32"/>
-              </w:rPr>
-              <w:t>、</w:t>
-            </w:r>
-            <w:r>
-              <w:rPr>
-                <w:rFonts w:hint="eastAsia"/>
-                <w:sz w:val="21"/>
-                <w:szCs w:val="32"/>
-              </w:rPr>
-              <w:t>Word</w:t>
-            </w:r>
-            <w:r>
-              <w:rPr>
-                <w:rFonts w:hint="eastAsia"/>
-                <w:sz w:val="21"/>
-                <w:szCs w:val="32"/>
-              </w:rPr>
-              <w:t>、</w:t>
-            </w:r>
-            <w:r>
-              <w:rPr>
-                <w:rFonts w:hint="eastAsia"/>
-                <w:sz w:val="21"/>
-                <w:szCs w:val="32"/>
-              </w:rPr>
-              <w:t>OBS</w:t>
-            </w:r>
-            <w:r>
-              <w:rPr>
-                <w:rFonts w:hint="eastAsia"/>
-                <w:sz w:val="21"/>
-                <w:szCs w:val="32"/>
-              </w:rPr>
-              <w:t>、</w:t>
-            </w:r>
-            <w:r>
-              <w:rPr>
-                <w:rFonts w:hint="eastAsia"/>
-                <w:sz w:val="21"/>
-                <w:szCs w:val="32"/>
-              </w:rPr>
-              <w:t>FFmpeg</w:t>
-            </w:r>
-            <w:r>
-              <w:rPr>
-                <w:rFonts w:hint="eastAsia"/>
-                <w:sz w:val="21"/>
-                <w:szCs w:val="32"/>
-              </w:rPr>
-              <w:t>、</w:t>
-            </w:r>
-            <w:r>
-              <w:rPr>
-                <w:rFonts w:hint="eastAsia"/>
-                <w:sz w:val="21"/>
-                <w:szCs w:val="32"/>
-              </w:rPr>
-              <w:t>Windows</w:t>
-            </w:r>
-            <w:r>
-              <w:rPr>
-                <w:rFonts w:hint="eastAsia"/>
-                <w:sz w:val="21"/>
-                <w:szCs w:val="32"/>
-              </w:rPr>
-              <w:t>本地</w:t>
-            </w:r>
-            <w:r>
-              <w:rPr>
-                <w:rFonts w:hint="eastAsia"/>
-                <w:sz w:val="21"/>
-                <w:szCs w:val="32"/>
-              </w:rPr>
-              <w:t>SAPI</w:t>
-            </w:r>
-            <w:r>
-              <w:rPr>
-                <w:rFonts w:hint="eastAsia"/>
-                <w:sz w:val="21"/>
-                <w:szCs w:val="32"/>
-              </w:rPr>
-              <w:t>语音。详见附录。</w:t>
-            </w:r>
-          </w:p>
-        </w:tc>
-      </w:tr>
-      <w:tr>
-        <w:trPr>
-          <w:cantSplit/>
-          <w:trHeight w:val="907"/>
-        </w:trPr>
-        <w:tc>
-          <w:tcPr>
-            <w:tcW w:w="890" w:type="pct"/>
-            <w:tcMar>
-              <w:top w:w="80" w:type="dxa"/>
-              <w:left w:w="120" w:type="dxa"/>
-              <w:bottom w:w="80" w:type="dxa"/>
-              <w:right w:w="120" w:type="dxa"/>
-            </w:tcMar>
-            <w:vAlign w:val="center"/>
-          </w:tcPr>
-          <w:p>
-            <w:pPr>
-              <w:keepLines/>
-              <w:spacing w:after="0" w:line="280" w:lineRule="exact"/>
-              <w:ind w:firstLine="0"/>
-              <w:jc w:val="center"/>
-              <w:rPr>
-                <w:sz w:val="21"/>
-                <w:szCs w:val="32"/>
-              </w:rPr>
-            </w:pPr>
-            <w:r>
-              <w:rPr>
-                <w:rFonts w:ascii="Calibri" w:eastAsia="黑体" w:hAnsi="Calibri"/>
-                <w:b/>
-                <w:color w:val="202020"/>
-                <w:sz w:val="21"/>
-                <w:szCs w:val="32"/>
-              </w:rPr>
-              <w:t>主要使用阶段</w:t>
-            </w:r>
-          </w:p>
-        </w:tc>
-        <w:tc>
-          <w:tcPr>
-            <w:tcW w:w="2041" w:type="pct"/>
-            <w:tcMar>
-              <w:top w:w="80" w:type="dxa"/>
-              <w:left w:w="120" w:type="dxa"/>
-              <w:bottom w:w="80" w:type="dxa"/>
-              <w:right w:w="120" w:type="dxa"/>
-            </w:tcMar>
-            <w:vAlign w:val="center"/>
-          </w:tcPr>
-          <w:p>
-            <w:pPr>
-              <w:keepLines/>
-              <w:spacing w:after="0" w:line="280" w:lineRule="exact"/>
-              <w:ind w:firstLine="0"/>
-              <w:rPr>
-                <w:sz w:val="21"/>
-                <w:szCs w:val="32"/>
-              </w:rPr>
-            </w:pPr>
-            <w:r>
-              <w:rPr>
-                <w:rFonts w:ascii="Calibri" w:hAnsi="Calibri"/>
-                <w:color w:val="202020"/>
-                <w:sz w:val="21"/>
-                <w:szCs w:val="32"/>
-              </w:rPr>
-              <w:t>□</w:t>
-            </w:r>
-            <w:r>
-              <w:rPr>
-                <w:rFonts w:ascii="Calibri" w:hAnsi="Calibri"/>
-                <w:color w:val="202020"/>
-                <w:sz w:val="21"/>
-                <w:szCs w:val="32"/>
-              </w:rPr>
-              <w:t>资料检索</w:t>
-            </w:r>
-            <w:r>
-              <w:rPr>
-                <w:rFonts w:ascii="Calibri" w:hAnsi="Calibri"/>
-                <w:color w:val="202020"/>
-                <w:sz w:val="21"/>
-                <w:szCs w:val="32"/>
-              </w:rPr>
-              <w:t xml:space="preserve">  □</w:t>
-            </w:r>
-            <w:r>
-              <w:rPr>
-                <w:rFonts w:ascii="Calibri" w:hAnsi="Calibri"/>
-                <w:color w:val="202020"/>
-                <w:sz w:val="21"/>
-                <w:szCs w:val="32"/>
-              </w:rPr>
-              <w:t>方案讨论</w:t>
-            </w:r>
-            <w:r>
-              <w:rPr>
-                <w:rFonts w:ascii="Calibri" w:hAnsi="Calibri"/>
-                <w:color w:val="202020"/>
-                <w:sz w:val="21"/>
-                <w:szCs w:val="32"/>
-              </w:rPr>
-              <w:t xml:space="preserve">  □</w:t>
-            </w:r>
-            <w:r>
-              <w:rPr>
-                <w:rFonts w:ascii="Calibri" w:hAnsi="Calibri"/>
-                <w:color w:val="202020"/>
-                <w:sz w:val="21"/>
-                <w:szCs w:val="32"/>
-              </w:rPr>
-              <w:t>代码补全</w:t>
-            </w:r>
-            <w:r>
-              <w:rPr>
-                <w:rFonts w:ascii="Calibri" w:hAnsi="Calibri"/>
-                <w:color w:val="202020"/>
-                <w:sz w:val="21"/>
-                <w:szCs w:val="32"/>
-              </w:rPr>
-              <w:t xml:space="preserve">  □</w:t>
-            </w:r>
-            <w:r>
-              <w:rPr>
-                <w:rFonts w:ascii="Calibri" w:hAnsi="Calibri"/>
-                <w:color w:val="202020"/>
-                <w:sz w:val="21"/>
-                <w:szCs w:val="32"/>
-              </w:rPr>
-              <w:t>调试</w:t>
-            </w:r>
-            <w:r>
-              <w:rPr>
-                <w:rFonts w:ascii="Calibri" w:hAnsi="Calibri"/>
-                <w:color w:val="202020"/>
-                <w:sz w:val="21"/>
-                <w:szCs w:val="32"/>
-              </w:rPr>
-              <w:t>/</w:t>
-            </w:r>
-            <w:r>
-              <w:rPr>
-                <w:rFonts w:ascii="Calibri" w:hAnsi="Calibri"/>
-                <w:color w:val="202020"/>
-                <w:sz w:val="21"/>
-                <w:szCs w:val="32"/>
-              </w:rPr>
-              <w:t>重构</w:t>
-            </w:r>
-            <w:r>
-              <w:rPr>
-                <w:rFonts w:ascii="Calibri" w:hAnsi="Calibri"/>
-                <w:color w:val="202020"/>
-                <w:sz w:val="21"/>
-                <w:szCs w:val="32"/>
-              </w:rPr>
-              <w:t xml:space="preserve">  □</w:t>
-            </w:r>
-            <w:r>
-              <w:rPr>
-                <w:rFonts w:ascii="Calibri" w:hAnsi="Calibri"/>
-                <w:color w:val="202020"/>
-                <w:sz w:val="21"/>
-                <w:szCs w:val="32"/>
-              </w:rPr>
-              <w:t>测试</w:t>
-            </w:r>
-            <w:r>
-              <w:rPr>
-                <w:rFonts w:ascii="Calibri" w:hAnsi="Calibri"/>
-                <w:color w:val="202020"/>
-                <w:sz w:val="21"/>
-                <w:szCs w:val="32"/>
-              </w:rPr>
-              <w:t xml:space="preserve">  □</w:t>
-            </w:r>
-            <w:r>
-              <w:rPr>
-                <w:rFonts w:ascii="Calibri" w:hAnsi="Calibri"/>
-                <w:color w:val="202020"/>
-                <w:sz w:val="21"/>
-                <w:szCs w:val="32"/>
-              </w:rPr>
-              <w:t>文档</w:t>
-            </w:r>
-            <w:r>
-              <w:rPr>
-                <w:rFonts w:ascii="Calibri" w:hAnsi="Calibri"/>
-                <w:color w:val="202020"/>
-                <w:sz w:val="21"/>
-                <w:szCs w:val="32"/>
-              </w:rPr>
-              <w:t>/</w:t>
-            </w:r>
-            <w:r>
-              <w:rPr>
-                <w:rFonts w:ascii="Calibri" w:hAnsi="Calibri"/>
-                <w:color w:val="202020"/>
-                <w:sz w:val="21"/>
-                <w:szCs w:val="32"/>
-              </w:rPr>
-              <w:t>演示</w:t>
-            </w:r>
-            <w:r>
-              <w:rPr>
-                <w:rFonts w:ascii="Calibri" w:hAnsi="Calibri"/>
-                <w:color w:val="202020"/>
-                <w:sz w:val="21"/>
-                <w:szCs w:val="32"/>
-              </w:rPr>
-              <w:t xml:space="preserve">  </w:t>
-            </w:r>
-          </w:p>
-          <w:p>
-            <w:pPr>
-              <w:keepLines/>
-              <w:spacing w:after="0" w:line="280" w:lineRule="exact"/>
-              <w:ind w:firstLine="0"/>
-              <w:rPr>
-                <w:sz w:val="21"/>
-                <w:szCs w:val="32"/>
-              </w:rPr>
-            </w:pPr>
-            <w:r>
-              <w:rPr>
-                <w:rFonts w:ascii="Calibri" w:hAnsi="Calibri"/>
-                <w:color w:val="202020"/>
-                <w:sz w:val="21"/>
-                <w:szCs w:val="32"/>
-              </w:rPr>
-              <w:t>□</w:t>
-            </w:r>
-            <w:r>
-              <w:rPr>
-                <w:rFonts w:ascii="Calibri" w:hAnsi="Calibri"/>
-                <w:color w:val="202020"/>
-                <w:sz w:val="21"/>
-                <w:szCs w:val="32"/>
-              </w:rPr>
-              <w:t>其他</w:t>
-            </w:r>
-          </w:p>
-        </w:tc>
-        <w:tc>
-          <w:tcPr>
-            <w:tcW w:w="2069" w:type="pct"/>
-            <w:tcMar>
-              <w:top w:w="80" w:type="dxa"/>
-              <w:left w:w="120" w:type="dxa"/>
-              <w:bottom w:w="80" w:type="dxa"/>
-              <w:right w:w="120" w:type="dxa"/>
-            </w:tcMar>
-            <w:vAlign w:val="center"/>
-          </w:tcPr>
-          <w:p>
-            <w:pPr>
-              <w:keepLines/>
-              <w:spacing w:after="0" w:line="280" w:lineRule="exact"/>
-              <w:ind w:firstLine="0"/>
-              <w:rPr>
-                <w:sz w:val="21"/>
-                <w:szCs w:val="32"/>
-              </w:rPr>
-            </w:pPr>
-            <w:r>
-              <w:rPr>
-                <w:rFonts w:hint="eastAsia"/>
-                <w:sz w:val="21"/>
-                <w:szCs w:val="32"/>
-              </w:rPr>
-              <w:t>资料检索；方案讨论；调试</w:t>
-            </w:r>
-            <w:r>
-              <w:rPr>
-                <w:rFonts w:hint="eastAsia"/>
-                <w:sz w:val="21"/>
-                <w:szCs w:val="32"/>
-              </w:rPr>
-              <w:t>/</w:t>
-            </w:r>
-            <w:r>
-              <w:rPr>
-                <w:rFonts w:hint="eastAsia"/>
-                <w:sz w:val="21"/>
-                <w:szCs w:val="32"/>
-              </w:rPr>
-              <w:t>重构；测试；文档</w:t>
-            </w:r>
-            <w:r>
-              <w:rPr>
-                <w:rFonts w:hint="eastAsia"/>
-                <w:sz w:val="21"/>
-                <w:szCs w:val="32"/>
-              </w:rPr>
-              <w:t>/</w:t>
-            </w:r>
-            <w:r>
-              <w:rPr>
-                <w:rFonts w:hint="eastAsia"/>
-                <w:sz w:val="21"/>
-                <w:szCs w:val="32"/>
-              </w:rPr>
-              <w:t>演示；其他：决赛目录与提交材料整理。</w:t>
-            </w:r>
-          </w:p>
-        </w:tc>
-      </w:tr>
-      <w:tr>
-        <w:trPr>
-          <w:cantSplit/>
-          <w:trHeight w:val="907"/>
-        </w:trPr>
-        <w:tc>
-          <w:tcPr>
-            <w:tcW w:w="890" w:type="pct"/>
-            <w:tcMar>
-              <w:top w:w="80" w:type="dxa"/>
-              <w:left w:w="120" w:type="dxa"/>
-              <w:bottom w:w="80" w:type="dxa"/>
-              <w:right w:w="120" w:type="dxa"/>
-            </w:tcMar>
-            <w:vAlign w:val="center"/>
-          </w:tcPr>
-          <w:p>
-            <w:pPr>
-              <w:keepLines/>
-              <w:spacing w:after="0" w:line="280" w:lineRule="exact"/>
-              <w:ind w:firstLine="0"/>
-              <w:jc w:val="center"/>
-              <w:rPr>
-                <w:rFonts w:eastAsia="黑体"/>
-                <w:b/>
-                <w:sz w:val="21"/>
-                <w:szCs w:val="32"/>
-              </w:rPr>
-            </w:pPr>
-            <w:r>
-              <w:rPr>
-                <w:rFonts w:ascii="Calibri" w:eastAsia="黑体" w:hAnsi="Calibri"/>
-                <w:b/>
-                <w:color w:val="202020"/>
-                <w:sz w:val="21"/>
-                <w:szCs w:val="32"/>
-              </w:rPr>
-              <w:t>涉及模块</w:t>
-            </w:r>
-          </w:p>
-          <w:p>
-            <w:pPr>
-              <w:keepLines/>
-              <w:spacing w:after="0" w:line="280" w:lineRule="exact"/>
-              <w:ind w:firstLine="0"/>
-              <w:jc w:val="center"/>
-              <w:rPr>
-                <w:sz w:val="21"/>
-                <w:szCs w:val="32"/>
-              </w:rPr>
-            </w:pPr>
-            <w:r>
-              <w:rPr>
-                <w:rFonts w:ascii="Calibri" w:eastAsia="黑体" w:hAnsi="Calibri"/>
-                <w:b/>
-                <w:color w:val="202020"/>
-                <w:sz w:val="21"/>
-                <w:szCs w:val="32"/>
-              </w:rPr>
-              <w:t>或成果</w:t>
-            </w:r>
-          </w:p>
-        </w:tc>
-        <w:tc>
-          <w:tcPr>
-            <w:tcW w:w="2041" w:type="pct"/>
-            <w:tcMar>
-              <w:top w:w="80" w:type="dxa"/>
-              <w:left w:w="120" w:type="dxa"/>
-              <w:bottom w:w="80" w:type="dxa"/>
-              <w:right w:w="120" w:type="dxa"/>
-            </w:tcMar>
-            <w:vAlign w:val="center"/>
-          </w:tcPr>
-          <w:p>
-            <w:pPr>
-              <w:keepLines/>
-              <w:spacing w:after="0" w:line="280" w:lineRule="exact"/>
-              <w:ind w:firstLine="0"/>
-              <w:rPr>
-                <w:sz w:val="21"/>
-                <w:szCs w:val="32"/>
-              </w:rPr>
-            </w:pPr>
-            <w:r>
-              <w:rPr>
-                <w:rFonts w:ascii="Calibri" w:hAnsi="Calibri"/>
-                <w:color w:val="202020"/>
-                <w:sz w:val="21"/>
-                <w:szCs w:val="32"/>
-              </w:rPr>
-              <w:t>列出具有实质影响的文件、模块、测试、文档或分析成果。</w:t>
-            </w:r>
-          </w:p>
-        </w:tc>
-        <w:tc>
-          <w:tcPr>
-            <w:tcW w:w="2069" w:type="pct"/>
-            <w:tcMar>
-              <w:top w:w="80" w:type="dxa"/>
-              <w:left w:w="120" w:type="dxa"/>
-              <w:bottom w:w="80" w:type="dxa"/>
-              <w:right w:w="120" w:type="dxa"/>
-            </w:tcMar>
-            <w:vAlign w:val="center"/>
-          </w:tcPr>
-          <w:p>
-            <w:pPr>
-              <w:keepLines/>
-              <w:spacing w:after="0" w:line="280" w:lineRule="exact"/>
-              <w:ind w:firstLine="0"/>
-              <w:rPr>
-                <w:sz w:val="21"/>
-                <w:szCs w:val="32"/>
-              </w:rPr>
-            </w:pPr>
-            <w:r>
-              <w:rPr>
-                <w:rFonts w:hint="eastAsia"/>
-                <w:sz w:val="21"/>
-                <w:szCs w:val="32"/>
-              </w:rPr>
-              <w:t>src</w:t>
-            </w:r>
-            <w:r>
-              <w:rPr>
-                <w:rFonts w:hint="eastAsia"/>
-                <w:sz w:val="21"/>
-                <w:szCs w:val="32"/>
-              </w:rPr>
-              <w:t>代码目录重组、</w:t>
-            </w:r>
-            <w:r>
-              <w:rPr>
-                <w:rFonts w:hint="eastAsia"/>
-                <w:sz w:val="21"/>
-                <w:szCs w:val="32"/>
-              </w:rPr>
-              <w:t>CLI</w:t>
-            </w:r>
-            <w:r>
-              <w:rPr>
-                <w:rFonts w:hint="eastAsia"/>
-                <w:sz w:val="21"/>
-                <w:szCs w:val="32"/>
-              </w:rPr>
-              <w:t>与测试修正；</w:t>
-            </w:r>
-            <w:r>
-              <w:rPr>
-                <w:rFonts w:hint="eastAsia"/>
-                <w:sz w:val="21"/>
-                <w:szCs w:val="32"/>
-              </w:rPr>
-              <w:t>README</w:t>
-            </w:r>
-            <w:r>
-              <w:rPr>
-                <w:rFonts w:hint="eastAsia"/>
-                <w:sz w:val="21"/>
-                <w:szCs w:val="32"/>
-              </w:rPr>
-              <w:t>和</w:t>
-            </w:r>
-            <w:r>
-              <w:rPr>
-                <w:rFonts w:hint="eastAsia"/>
-                <w:sz w:val="21"/>
-                <w:szCs w:val="32"/>
-              </w:rPr>
-              <w:t>docs</w:t>
-            </w:r>
-            <w:r>
-              <w:rPr>
-                <w:rFonts w:hint="eastAsia"/>
-                <w:sz w:val="21"/>
-                <w:szCs w:val="32"/>
-              </w:rPr>
-              <w:t>文稿；</w:t>
-            </w:r>
-            <w:r>
-              <w:rPr>
-                <w:rFonts w:hint="eastAsia"/>
-                <w:sz w:val="21"/>
-                <w:szCs w:val="32"/>
-              </w:rPr>
-              <w:t>PPT</w:t>
-            </w:r>
-            <w:r>
-              <w:rPr>
-                <w:rFonts w:hint="eastAsia"/>
-                <w:sz w:val="21"/>
-                <w:szCs w:val="32"/>
-              </w:rPr>
-              <w:t>标签纠正与</w:t>
-            </w:r>
-            <w:r>
-              <w:rPr>
-                <w:rFonts w:hint="eastAsia"/>
-                <w:sz w:val="21"/>
-                <w:szCs w:val="32"/>
-              </w:rPr>
-              <w:t>presentation</w:t>
-            </w:r>
-            <w:r>
-              <w:rPr>
-                <w:rFonts w:hint="eastAsia"/>
-                <w:sz w:val="21"/>
-                <w:szCs w:val="32"/>
-              </w:rPr>
-              <w:t>演示材料整理；原始实验数字与路径核对。</w:t>
-            </w:r>
-          </w:p>
-        </w:tc>
-      </w:tr>
-      <w:tr>
-        <w:trPr>
-          <w:cantSplit/>
-          <w:trHeight w:val="907"/>
-        </w:trPr>
-        <w:tc>
-          <w:tcPr>
-            <w:tcW w:w="890" w:type="pct"/>
-            <w:tcMar>
-              <w:top w:w="80" w:type="dxa"/>
-              <w:left w:w="120" w:type="dxa"/>
-              <w:bottom w:w="80" w:type="dxa"/>
-              <w:right w:w="120" w:type="dxa"/>
-            </w:tcMar>
-            <w:vAlign w:val="center"/>
-          </w:tcPr>
-          <w:p>
-            <w:pPr>
-              <w:keepLines/>
-              <w:spacing w:after="0" w:line="280" w:lineRule="exact"/>
-              <w:ind w:firstLine="0"/>
-              <w:jc w:val="center"/>
-              <w:rPr>
-                <w:rFonts w:eastAsia="黑体"/>
-                <w:b/>
-                <w:sz w:val="21"/>
-                <w:szCs w:val="32"/>
-              </w:rPr>
-            </w:pPr>
-            <w:r>
-              <w:rPr>
-                <w:rFonts w:ascii="Calibri" w:eastAsia="黑体" w:hAnsi="Calibri"/>
-                <w:b/>
-                <w:color w:val="202020"/>
-                <w:sz w:val="21"/>
-                <w:szCs w:val="32"/>
-              </w:rPr>
-              <w:t>人工检查</w:t>
-            </w:r>
-          </w:p>
-          <w:p>
-            <w:pPr>
-              <w:keepLines/>
-              <w:spacing w:after="0" w:line="280" w:lineRule="exact"/>
-              <w:ind w:firstLine="0"/>
-              <w:jc w:val="center"/>
-              <w:rPr>
-                <w:sz w:val="21"/>
-                <w:szCs w:val="32"/>
-              </w:rPr>
-            </w:pPr>
-            <w:r>
-              <w:rPr>
-                <w:rFonts w:ascii="Calibri" w:eastAsia="黑体" w:hAnsi="Calibri"/>
-                <w:b/>
-                <w:color w:val="202020"/>
-                <w:sz w:val="21"/>
-                <w:szCs w:val="32"/>
-              </w:rPr>
-              <w:t>与验证</w:t>
-            </w:r>
-          </w:p>
-        </w:tc>
-        <w:tc>
-          <w:tcPr>
-            <w:tcW w:w="2041" w:type="pct"/>
-            <w:tcMar>
-              <w:top w:w="80" w:type="dxa"/>
-              <w:left w:w="120" w:type="dxa"/>
-              <w:bottom w:w="80" w:type="dxa"/>
-              <w:right w:w="120" w:type="dxa"/>
-            </w:tcMar>
-            <w:vAlign w:val="center"/>
-          </w:tcPr>
-          <w:p>
-            <w:pPr>
-              <w:keepLines/>
-              <w:spacing w:after="0" w:line="280" w:lineRule="exact"/>
-              <w:ind w:firstLine="0"/>
-              <w:rPr>
-                <w:sz w:val="21"/>
-                <w:szCs w:val="32"/>
-              </w:rPr>
-            </w:pPr>
-            <w:r>
-              <w:rPr>
-                <w:rFonts w:ascii="Calibri" w:hAnsi="Calibri"/>
-                <w:color w:val="202020"/>
-                <w:sz w:val="21"/>
-                <w:szCs w:val="32"/>
-              </w:rPr>
-              <w:t>说明由谁审查、如何测试、如何核对事实和许可证、如何处理错误输出。</w:t>
-            </w:r>
-          </w:p>
-        </w:tc>
-        <w:tc>
-          <w:tcPr>
-            <w:tcW w:w="2069" w:type="pct"/>
-            <w:tcMar>
-              <w:top w:w="80" w:type="dxa"/>
-              <w:left w:w="120" w:type="dxa"/>
-              <w:bottom w:w="80" w:type="dxa"/>
-              <w:right w:w="120" w:type="dxa"/>
-            </w:tcMar>
-            <w:vAlign w:val="center"/>
-          </w:tcPr>
-          <w:p>
-            <w:pPr>
-              <w:keepLines/>
-              <w:spacing w:after="0" w:line="280" w:lineRule="exact"/>
-              <w:ind w:firstLine="0"/>
-              <w:rPr>
-                <w:sz w:val="21"/>
-                <w:szCs w:val="32"/>
-              </w:rPr>
-            </w:pPr>
-            <w:r>
-              <w:rPr>
-                <w:rFonts w:hint="eastAsia"/>
-                <w:sz w:val="21"/>
-                <w:szCs w:val="32"/>
-              </w:rPr>
-              <w:t>按团队提供分工：</w:t>
-            </w:r>
-            <w:r>
-              <w:rPr>
-                <w:rFonts w:hint="eastAsia"/>
-                <w:sz w:val="21"/>
-                <w:szCs w:val="32"/>
-              </w:rPr>
-              <w:t>A</w:t>
-            </w:r>
-            <w:r>
-              <w:rPr>
-                <w:rFonts w:hint="eastAsia"/>
-                <w:sz w:val="21"/>
-                <w:szCs w:val="32"/>
-              </w:rPr>
-              <w:t>负责运行实验</w:t>
-            </w:r>
-            <w:r>
-              <w:rPr>
-                <w:rFonts w:hint="eastAsia"/>
-                <w:sz w:val="21"/>
-                <w:szCs w:val="32"/>
-              </w:rPr>
-              <w:t>/</w:t>
-            </w:r>
-            <w:r>
-              <w:rPr>
-                <w:rFonts w:hint="eastAsia"/>
-                <w:sz w:val="21"/>
-                <w:szCs w:val="32"/>
-              </w:rPr>
-              <w:t>测试及数字核对；</w:t>
-            </w:r>
-            <w:r>
-              <w:rPr>
-                <w:rFonts w:hint="eastAsia"/>
-                <w:sz w:val="21"/>
-                <w:szCs w:val="32"/>
-              </w:rPr>
-              <w:t>B</w:t>
-            </w:r>
-            <w:r>
-              <w:rPr>
-                <w:rFonts w:hint="eastAsia"/>
-                <w:sz w:val="21"/>
-                <w:szCs w:val="32"/>
-              </w:rPr>
-              <w:t>负责文稿、</w:t>
-            </w:r>
-            <w:r>
-              <w:rPr>
-                <w:rFonts w:hint="eastAsia"/>
-                <w:sz w:val="21"/>
-                <w:szCs w:val="32"/>
-              </w:rPr>
-              <w:t>README</w:t>
-            </w:r>
-            <w:r>
-              <w:rPr>
-                <w:rFonts w:hint="eastAsia"/>
-                <w:sz w:val="21"/>
-                <w:szCs w:val="32"/>
-              </w:rPr>
-              <w:t>、匿名化与索引；</w:t>
-            </w:r>
-            <w:r>
-              <w:rPr>
-                <w:rFonts w:hint="eastAsia"/>
-                <w:sz w:val="21"/>
-                <w:szCs w:val="32"/>
-              </w:rPr>
-              <w:t>C</w:t>
-            </w:r>
-            <w:r>
-              <w:rPr>
-                <w:rFonts w:hint="eastAsia"/>
-                <w:sz w:val="21"/>
-                <w:szCs w:val="32"/>
-              </w:rPr>
-              <w:t>负责</w:t>
-            </w:r>
-            <w:r>
-              <w:rPr>
-                <w:rFonts w:hint="eastAsia"/>
-                <w:sz w:val="21"/>
-                <w:szCs w:val="32"/>
-              </w:rPr>
-              <w:t>PPT</w:t>
-            </w:r>
-            <w:r>
-              <w:rPr>
-                <w:rFonts w:hint="eastAsia"/>
-                <w:sz w:val="21"/>
-                <w:szCs w:val="32"/>
-              </w:rPr>
-              <w:t>、演示及讲解。已亲自完成的审核项目由团队据实确认，不能以</w:t>
-            </w:r>
-            <w:r>
-              <w:rPr>
-                <w:rFonts w:hint="eastAsia"/>
-                <w:sz w:val="21"/>
-                <w:szCs w:val="32"/>
-              </w:rPr>
-              <w:t>AI</w:t>
-            </w:r>
-            <w:r>
-              <w:rPr>
-                <w:rFonts w:hint="eastAsia"/>
-                <w:sz w:val="21"/>
-                <w:szCs w:val="32"/>
-              </w:rPr>
-              <w:t>核验代替人工全面审查。</w:t>
-            </w:r>
-          </w:p>
-        </w:tc>
-      </w:tr>
-      <w:tr>
-        <w:trPr>
-          <w:cantSplit/>
-          <w:trHeight w:val="907"/>
-        </w:trPr>
-        <w:tc>
-          <w:tcPr>
-            <w:tcW w:w="890" w:type="pct"/>
-            <w:tcMar>
-              <w:top w:w="80" w:type="dxa"/>
-              <w:left w:w="120" w:type="dxa"/>
-              <w:bottom w:w="80" w:type="dxa"/>
-              <w:right w:w="120" w:type="dxa"/>
-            </w:tcMar>
-            <w:vAlign w:val="center"/>
-          </w:tcPr>
-          <w:p>
-            <w:pPr>
-              <w:keepLines/>
-              <w:spacing w:after="0" w:line="280" w:lineRule="exact"/>
-              <w:ind w:firstLine="0"/>
-              <w:jc w:val="center"/>
-              <w:rPr>
-                <w:sz w:val="21"/>
-                <w:szCs w:val="32"/>
-              </w:rPr>
-            </w:pPr>
-            <w:r>
-              <w:rPr>
-                <w:rFonts w:ascii="Calibri" w:eastAsia="黑体" w:hAnsi="Calibri"/>
-                <w:b/>
-                <w:color w:val="202020"/>
-                <w:sz w:val="21"/>
-                <w:szCs w:val="32"/>
-              </w:rPr>
-              <w:t>第三方代码</w:t>
-            </w:r>
-            <w:r>
-              <w:rPr>
-                <w:rFonts w:ascii="Calibri" w:eastAsia="黑体" w:hAnsi="Calibri"/>
-                <w:b/>
-                <w:color w:val="202020"/>
-                <w:sz w:val="21"/>
-                <w:szCs w:val="32"/>
-              </w:rPr>
-              <w:t>/</w:t>
-            </w:r>
-            <w:r>
-              <w:rPr>
-                <w:rFonts w:ascii="Calibri" w:eastAsia="黑体" w:hAnsi="Calibri"/>
-                <w:b/>
-                <w:color w:val="202020"/>
-                <w:sz w:val="21"/>
-                <w:szCs w:val="32"/>
-              </w:rPr>
-              <w:t>模型</w:t>
-            </w:r>
-            <w:r>
-              <w:rPr>
-                <w:rFonts w:ascii="Calibri" w:eastAsia="黑体" w:hAnsi="Calibri"/>
-                <w:b/>
-                <w:color w:val="202020"/>
-                <w:sz w:val="21"/>
-                <w:szCs w:val="32"/>
-              </w:rPr>
-              <w:t>/</w:t>
-            </w:r>
-            <w:r>
-              <w:rPr>
-                <w:rFonts w:ascii="Calibri" w:eastAsia="黑体" w:hAnsi="Calibri"/>
-                <w:b/>
-                <w:color w:val="202020"/>
-                <w:sz w:val="21"/>
-                <w:szCs w:val="32"/>
-              </w:rPr>
-              <w:t>数据</w:t>
-            </w:r>
-          </w:p>
-        </w:tc>
-        <w:tc>
-          <w:tcPr>
-            <w:tcW w:w="2041" w:type="pct"/>
-            <w:tcMar>
-              <w:top w:w="80" w:type="dxa"/>
-              <w:left w:w="120" w:type="dxa"/>
-              <w:bottom w:w="80" w:type="dxa"/>
-              <w:right w:w="120" w:type="dxa"/>
-            </w:tcMar>
-            <w:vAlign w:val="center"/>
-          </w:tcPr>
-          <w:p>
-            <w:pPr>
-              <w:keepLines/>
-              <w:spacing w:after="0" w:line="280" w:lineRule="exact"/>
-              <w:ind w:firstLine="0"/>
-              <w:rPr>
-                <w:sz w:val="21"/>
-                <w:szCs w:val="32"/>
-              </w:rPr>
-            </w:pPr>
-            <w:r>
-              <w:rPr>
-                <w:rFonts w:ascii="Calibri" w:hAnsi="Calibri"/>
-                <w:color w:val="202020"/>
-                <w:sz w:val="21"/>
-                <w:szCs w:val="32"/>
-              </w:rPr>
-              <w:t>列出名称、来源、版本、许可证或授权方式；无则填写</w:t>
-            </w:r>
-            <w:r>
-              <w:rPr>
-                <w:rFonts w:ascii="Calibri" w:hAnsi="Calibri"/>
-                <w:color w:val="202020"/>
-                <w:sz w:val="21"/>
-                <w:szCs w:val="32"/>
-              </w:rPr>
-              <w:t>“</w:t>
-            </w:r>
-            <w:r>
-              <w:rPr>
-                <w:rFonts w:ascii="Calibri" w:hAnsi="Calibri"/>
-                <w:color w:val="202020"/>
-                <w:sz w:val="21"/>
-                <w:szCs w:val="32"/>
-              </w:rPr>
-              <w:t>无</w:t>
-            </w:r>
-            <w:r>
-              <w:rPr>
-                <w:rFonts w:ascii="Calibri" w:hAnsi="Calibri"/>
-                <w:color w:val="202020"/>
-                <w:sz w:val="21"/>
-                <w:szCs w:val="32"/>
-              </w:rPr>
-              <w:t>”</w:t>
-            </w:r>
-            <w:r>
-              <w:rPr>
-                <w:rFonts w:ascii="Calibri" w:hAnsi="Calibri"/>
-                <w:color w:val="202020"/>
-                <w:sz w:val="21"/>
-                <w:szCs w:val="32"/>
-              </w:rPr>
-              <w:t>。</w:t>
-            </w:r>
-          </w:p>
-        </w:tc>
-        <w:tc>
-          <w:tcPr>
-            <w:tcW w:w="2069" w:type="pct"/>
-            <w:tcMar>
-              <w:top w:w="80" w:type="dxa"/>
-              <w:left w:w="120" w:type="dxa"/>
-              <w:bottom w:w="80" w:type="dxa"/>
-              <w:right w:w="120" w:type="dxa"/>
-            </w:tcMar>
-            <w:vAlign w:val="center"/>
-          </w:tcPr>
-          <w:p>
-            <w:pPr>
-              <w:keepLines/>
-              <w:spacing w:after="0" w:line="280" w:lineRule="exact"/>
-              <w:ind w:firstLine="0"/>
-              <w:rPr>
-                <w:sz w:val="21"/>
-                <w:szCs w:val="32"/>
-              </w:rPr>
-            </w:pPr>
-            <w:r>
-              <w:rPr>
-                <w:rFonts w:hint="eastAsia"/>
-                <w:sz w:val="21"/>
-                <w:szCs w:val="32"/>
-              </w:rPr>
-              <w:t>运行库、</w:t>
-            </w:r>
-            <w:r>
-              <w:rPr>
-                <w:rFonts w:hint="eastAsia"/>
-                <w:sz w:val="21"/>
-                <w:szCs w:val="32"/>
-              </w:rPr>
-              <w:t>CBC</w:t>
-            </w:r>
-            <w:r>
-              <w:rPr>
-                <w:rFonts w:hint="eastAsia"/>
-                <w:sz w:val="21"/>
-                <w:szCs w:val="32"/>
-              </w:rPr>
-              <w:t>及历史录屏</w:t>
-            </w:r>
-            <w:r>
-              <w:rPr>
-                <w:rFonts w:hint="eastAsia"/>
-                <w:sz w:val="21"/>
-                <w:szCs w:val="32"/>
-              </w:rPr>
-              <w:t>/</w:t>
-            </w:r>
-            <w:r>
-              <w:rPr>
-                <w:rFonts w:hint="eastAsia"/>
-                <w:sz w:val="21"/>
-                <w:szCs w:val="32"/>
-              </w:rPr>
-              <w:t>语音</w:t>
-            </w:r>
-            <w:r>
-              <w:rPr>
-                <w:rFonts w:hint="eastAsia"/>
-                <w:sz w:val="21"/>
-                <w:szCs w:val="32"/>
-              </w:rPr>
-              <w:t>/</w:t>
-            </w:r>
-            <w:r>
-              <w:rPr>
-                <w:rFonts w:hint="eastAsia"/>
-                <w:sz w:val="21"/>
-                <w:szCs w:val="32"/>
-              </w:rPr>
-              <w:t>视频工具来源、版本与许可证见附录；模型与</w:t>
-            </w:r>
-            <w:r>
-              <w:rPr>
-                <w:rFonts w:hint="eastAsia"/>
-                <w:sz w:val="21"/>
-                <w:szCs w:val="32"/>
-              </w:rPr>
-              <w:t>DAG</w:t>
-            </w:r>
-            <w:r>
-              <w:rPr>
-                <w:rFonts w:hint="eastAsia"/>
-                <w:sz w:val="21"/>
-                <w:szCs w:val="32"/>
-              </w:rPr>
-              <w:t>由项目训练</w:t>
-            </w:r>
-            <w:r>
-              <w:rPr>
-                <w:rFonts w:hint="eastAsia"/>
-                <w:sz w:val="21"/>
-                <w:szCs w:val="32"/>
-              </w:rPr>
-              <w:t>/</w:t>
-            </w:r>
-            <w:r>
-              <w:rPr>
-                <w:rFonts w:hint="eastAsia"/>
-                <w:sz w:val="21"/>
-                <w:szCs w:val="32"/>
-              </w:rPr>
-              <w:t>生成。未完成源码复制改写的逐行统计，不填写</w:t>
-            </w:r>
-            <w:r>
-              <w:rPr>
-                <w:rFonts w:hint="eastAsia"/>
-                <w:sz w:val="21"/>
-                <w:szCs w:val="32"/>
-              </w:rPr>
-              <w:t>0</w:t>
-            </w:r>
-            <w:r>
-              <w:rPr>
-                <w:rFonts w:hint="eastAsia"/>
-                <w:sz w:val="21"/>
-                <w:szCs w:val="32"/>
-              </w:rPr>
-              <w:t>行或原创比例。</w:t>
-            </w:r>
-          </w:p>
-        </w:tc>
-      </w:tr>
-      <w:tr>
-        <w:trPr>
-          <w:cantSplit/>
-          <w:trHeight w:val="907"/>
-        </w:trPr>
-        <w:tc>
-          <w:tcPr>
-            <w:tcW w:w="890" w:type="pct"/>
-            <w:tcMar>
-              <w:top w:w="80" w:type="dxa"/>
-              <w:left w:w="120" w:type="dxa"/>
-              <w:bottom w:w="80" w:type="dxa"/>
-              <w:right w:w="120" w:type="dxa"/>
-            </w:tcMar>
-            <w:vAlign w:val="center"/>
-          </w:tcPr>
-          <w:p>
-            <w:pPr>
-              <w:keepLines/>
-              <w:spacing w:after="0" w:line="280" w:lineRule="exact"/>
-              <w:ind w:firstLine="0"/>
-              <w:jc w:val="center"/>
-              <w:rPr>
-                <w:sz w:val="21"/>
-                <w:szCs w:val="32"/>
-              </w:rPr>
-            </w:pPr>
-            <w:r>
-              <w:rPr>
-                <w:rFonts w:ascii="Calibri" w:eastAsia="黑体" w:hAnsi="Calibri"/>
-                <w:b/>
-                <w:color w:val="202020"/>
-                <w:sz w:val="21"/>
-                <w:szCs w:val="32"/>
-              </w:rPr>
-              <w:t>限制与风险</w:t>
-            </w:r>
-          </w:p>
-        </w:tc>
-        <w:tc>
-          <w:tcPr>
-            <w:tcW w:w="2041" w:type="pct"/>
-            <w:tcMar>
-              <w:top w:w="80" w:type="dxa"/>
-              <w:left w:w="120" w:type="dxa"/>
-              <w:bottom w:w="80" w:type="dxa"/>
-              <w:right w:w="120" w:type="dxa"/>
-            </w:tcMar>
-            <w:vAlign w:val="center"/>
-          </w:tcPr>
-          <w:p>
-            <w:pPr>
-              <w:keepLines/>
-              <w:spacing w:after="0" w:line="280" w:lineRule="exact"/>
-              <w:ind w:firstLine="0"/>
-              <w:rPr>
-                <w:sz w:val="21"/>
-                <w:szCs w:val="32"/>
-              </w:rPr>
-            </w:pPr>
-            <w:r>
-              <w:rPr>
-                <w:rFonts w:ascii="Calibri" w:hAnsi="Calibri"/>
-                <w:color w:val="202020"/>
-                <w:sz w:val="21"/>
-                <w:szCs w:val="32"/>
-              </w:rPr>
-              <w:t>说明仍未完全解决的正确性、安全、隐私、许可证或可复现风险。</w:t>
-            </w:r>
-          </w:p>
-        </w:tc>
-        <w:tc>
-          <w:tcPr>
-            <w:tcW w:w="2069" w:type="pct"/>
-            <w:tcMar>
-              <w:top w:w="80" w:type="dxa"/>
-              <w:left w:w="120" w:type="dxa"/>
-              <w:bottom w:w="80" w:type="dxa"/>
-              <w:right w:w="120" w:type="dxa"/>
-            </w:tcMar>
-            <w:vAlign w:val="center"/>
-          </w:tcPr>
-          <w:p>
-            <w:pPr>
-              <w:keepLines/>
-              <w:spacing w:after="0" w:line="280" w:lineRule="exact"/>
-              <w:ind w:firstLine="0"/>
-              <w:rPr>
-                <w:sz w:val="21"/>
-                <w:szCs w:val="32"/>
-              </w:rPr>
-            </w:pPr>
-            <w:r>
-              <w:rPr>
-                <w:rFonts w:hint="eastAsia"/>
-                <w:sz w:val="21"/>
-                <w:szCs w:val="32"/>
-              </w:rPr>
-              <w:t>静态</w:t>
-            </w:r>
-            <w:r>
-              <w:rPr>
-                <w:rFonts w:hint="eastAsia"/>
-                <w:sz w:val="21"/>
-                <w:szCs w:val="32"/>
-              </w:rPr>
-              <w:t>DAG</w:t>
-            </w:r>
-            <w:r>
-              <w:rPr>
-                <w:rFonts w:hint="eastAsia"/>
-                <w:sz w:val="21"/>
-                <w:szCs w:val="32"/>
-              </w:rPr>
-              <w:t>；容量</w:t>
-            </w:r>
-            <w:r>
-              <w:rPr>
-                <w:rFonts w:hint="eastAsia"/>
-                <w:sz w:val="21"/>
-                <w:szCs w:val="32"/>
-              </w:rPr>
-              <w:t>30</w:t>
-            </w:r>
-            <w:r>
-              <w:rPr>
-                <w:rFonts w:hint="eastAsia"/>
-                <w:sz w:val="21"/>
-                <w:szCs w:val="32"/>
-              </w:rPr>
-              <w:t>，超容量启发式降级；同</w:t>
-            </w:r>
-            <w:r>
-              <w:rPr>
-                <w:rFonts w:hint="eastAsia"/>
-                <w:sz w:val="21"/>
-                <w:szCs w:val="32"/>
-              </w:rPr>
-              <w:t>checkpoint</w:t>
-            </w:r>
-            <w:r>
-              <w:rPr>
-                <w:rFonts w:hint="eastAsia"/>
-                <w:sz w:val="21"/>
-                <w:szCs w:val="32"/>
-              </w:rPr>
-              <w:t>五次推理重复；软预算与额外搜索耗时；容器用户态不等于原生内核。逐行溯源、完整许可</w:t>
-            </w:r>
-            <w:r>
-              <w:rPr>
-                <w:rFonts w:hint="eastAsia"/>
-                <w:sz w:val="21"/>
-                <w:szCs w:val="32"/>
-              </w:rPr>
-              <w:t>/</w:t>
-            </w:r>
-            <w:r>
-              <w:rPr>
-                <w:rFonts w:hint="eastAsia"/>
-                <w:sz w:val="21"/>
-                <w:szCs w:val="32"/>
-              </w:rPr>
-              <w:t>媒体复核和最终手抄尚待完成。</w:t>
-            </w:r>
-          </w:p>
-        </w:tc>
-      </w:tr>
-    </w:tbl>
-    <w:p>
-      <w:pPr>
-        <w:pageBreakBefore/>
-        <w:spacing w:after="200"/>
-        <w:rPr>
-          <w:color w:val="0000FF"/>
-        </w:rPr>
-      </w:pPr>
-      <w:r>
-        <w:rPr>
-          <w:rFonts w:ascii="Calibri" w:hAnsi="Calibri" w:hint="eastAsia"/>
-          <w:color w:val="0000FF"/>
-          <w:sz w:val="22"/>
-        </w:rPr>
-        <w:lastRenderedPageBreak/>
-        <w:t>（请将以下内容在以下空白处完整手抄一遍）</w:t>
-      </w:r>
-    </w:p>
-    <w:p>
-      <w:pPr>
-        <w:spacing w:after="200"/>
-        <w:rPr>
-          <w:b/>
-          <w:bCs/>
-        </w:rPr>
-      </w:pPr>
-      <w:r>
-        <w:rPr>
-          <w:rFonts w:ascii="Calibri" w:hAnsi="Calibri"/>
-          <w:b/>
-          <w:bCs/>
-          <w:color w:val="202020"/>
-          <w:sz w:val="22"/>
-        </w:rPr>
-        <w:t>团队声明：本队已如实说明具有实质影响的人工智能及第三方工具使用情况，并对项目的创新主张、技术方案、代码质量、知识产权、安全性及最终成果承担完整责任。</w:t>
-      </w:r>
-      <w:r>
-        <w:rPr>
-          <w:rFonts w:ascii="Calibri" w:hAnsi="Calibri" w:hint="eastAsia"/>
-          <w:b/>
-          <w:bCs/>
-          <w:color w:val="202020"/>
-          <w:sz w:val="22"/>
-        </w:rPr>
-        <w:t>队伍成员信息以中国研究生创新实践大赛官网报名系统所提交的人员名单为准。</w:t>
       </w:r>
     </w:p>
     <w:p>
@@ -1787,133 +144,6 @@
         <w:keepNext/>
         <w:ind w:firstLine="0"/>
         <w:rPr>
-          <w:rFonts w:hint="eastAsia"/>
-          <w:b/>
-        </w:rPr>
-      </w:pPr>
-      <w:r>
-        <w:rPr>
-          <w:rFonts w:hint="eastAsia"/>
-          <w:b/>
-        </w:rPr>
-        <w:t>待团队亲笔手抄并扫描（以下空白区域）</w:t>
-      </w:r>
-    </w:p>
-    <w:p>
-      <w:pPr>
-        <w:keepLines/>
-        <w:spacing w:after="0" w:line="3800" w:lineRule="exact"/>
-        <w:ind w:firstLine="0"/>
-      </w:pPr>
-      <w:r>
-        <w:t xml:space="preserve"> </w:t>
-      </w:r>
-    </w:p>
-    <w:p>
-      <w:pPr>
-        <w:spacing w:after="0" w:line="240" w:lineRule="auto"/>
-        <w:ind w:firstLine="0"/>
-      </w:pPr>
-      <w:r>
-        <w:br w:type="page"/>
-      </w:r>
-    </w:p>
-    <w:p>
-      <w:pPr>
-        <w:pStyle w:val="a8"/>
-        <w:rPr>
-          <w:rFonts w:hint="eastAsia"/>
-        </w:rPr>
-      </w:pPr>
-      <w:r>
-        <w:rPr>
-          <w:rFonts w:hint="eastAsia"/>
-        </w:rPr>
-        <w:lastRenderedPageBreak/>
-        <w:t>附录：工具使用、第三方来源与复核边界</w:t>
-      </w:r>
-    </w:p>
-    <w:p>
-      <w:pPr>
-        <w:pStyle w:val="1"/>
-        <w:rPr>
-          <w:rFonts w:hint="eastAsia"/>
-        </w:rPr>
-      </w:pPr>
-      <w:r>
-        <w:rPr>
-          <w:rFonts w:hint="eastAsia"/>
-        </w:rPr>
-        <w:t>工具或服务名称及主要使用阶段</w:t>
-      </w:r>
-    </w:p>
-    <w:p>
-      <w:pPr>
-        <w:rPr>
-          <w:rFonts w:hint="eastAsia"/>
-        </w:rPr>
-      </w:pPr>
-      <w:r>
-        <w:rPr>
-          <w:rFonts w:hint="eastAsia"/>
-        </w:rPr>
-        <w:t>团队确认：除本次</w:t>
-      </w:r>
-      <w:r>
-        <w:rPr>
-          <w:rFonts w:hint="eastAsia"/>
-        </w:rPr>
-        <w:t>Codex</w:t>
-      </w:r>
-      <w:r>
-        <w:rPr>
-          <w:rFonts w:hint="eastAsia"/>
-        </w:rPr>
-        <w:t>外，没有使用其他生成式人工智能工具。</w:t>
-      </w:r>
-      <w:r>
-        <w:rPr>
-          <w:rFonts w:hint="eastAsia"/>
-        </w:rPr>
-        <w:t>Codex</w:t>
-      </w:r>
-      <w:r>
-        <w:rPr>
-          <w:rFonts w:hint="eastAsia"/>
-        </w:rPr>
-        <w:t>在本轮用于资料检索、提交规范与方案讨论、文稿重组、代码路径重构和运行入口适配、测试与证据核对、</w:t>
-      </w:r>
-      <w:r>
-        <w:rPr>
-          <w:rFonts w:hint="eastAsia"/>
-        </w:rPr>
-        <w:t>PPT</w:t>
-      </w:r>
-      <w:r>
-        <w:rPr>
-          <w:rFonts w:hint="eastAsia"/>
-        </w:rPr>
-        <w:t>及演示材料整理和匿名化检查。其输出均属于辅助建议或自动化操作结果，不能代替参赛成员对最终作品的责任。未填写未经记录的模型型号或</w:t>
-      </w:r>
-      <w:r>
-        <w:rPr>
-          <w:rFonts w:hint="eastAsia"/>
-        </w:rPr>
-        <w:t>AI</w:t>
-      </w:r>
-      <w:r>
-        <w:rPr>
-          <w:rFonts w:hint="eastAsia"/>
-        </w:rPr>
-        <w:t>生成代码比例。</w:t>
-      </w:r>
-    </w:p>
-    <w:p>
-      <w:pPr>
-        <w:keepNext/>
-        <w:ind w:firstLine="0"/>
-        <w:rPr>
-          <w:rFonts w:hint="eastAsia"/>
           <w:sz w:val="21"/>
         </w:rPr>
       </w:pPr>
@@ -1944,7 +174,7 @@
           <w:bottom w:w="60" w:type="dxa"/>
           <w:right w:w="80" w:type="dxa"/>
         </w:tblCellMar>
-        <w:tblLook w:val="0000" w:firstRow="0" w:lastRow="0" w:firstColumn="0" w:lastColumn="0" w:noHBand="0" w:noVBand="0"/>
+        <w:tblLook w:val="04A0" w:firstRow="1" w:lastRow="0" w:firstColumn="1" w:lastColumn="0" w:noHBand="0" w:noVBand="1"/>
       </w:tblPr>
       <w:tblGrid>
         <w:gridCol w:w="1660"/>
@@ -2839,11 +1069,6 @@
     </w:tbl>
     <w:p/>
     <w:p>
-      <w:pPr>
-        <w:rPr>
-          <w:rFonts w:hint="eastAsia"/>
-        </w:rPr>
-      </w:pPr>
       <w:r>
         <w:rPr>
           <w:rFonts w:hint="eastAsia"/>
@@ -2878,9 +1103,6 @@
     <w:p>
       <w:pPr>
         <w:pStyle w:val="1"/>
-        <w:rPr>
-          <w:rFonts w:hint="eastAsia"/>
-        </w:rPr>
       </w:pPr>
       <w:r>
         <w:rPr>
@@ -2890,11 +1112,6 @@
       </w:r>
     </w:p>
     <w:p>
-      <w:pPr>
-        <w:rPr>
-          <w:rFonts w:hint="eastAsia"/>
-        </w:rPr>
-      </w:pPr>
       <w:r>
         <w:rPr>
           <w:rFonts w:hint="eastAsia"/>
@@ -3080,9 +1297,6 @@
     <w:p>
       <w:pPr>
         <w:pStyle w:val="1"/>
-        <w:rPr>
-          <w:rFonts w:hint="eastAsia"/>
-        </w:rPr>
       </w:pPr>
       <w:r>
         <w:rPr>
@@ -3092,11 +1306,6 @@
       </w:r>
     </w:p>
     <w:p>
-      <w:pPr>
-        <w:rPr>
-          <w:rFonts w:hint="eastAsia"/>
-        </w:rPr>
-      </w:pPr>
       <w:r>
         <w:rPr>
           <w:rFonts w:hint="eastAsia"/>
@@ -3201,11 +1410,6 @@
       </w:r>
     </w:p>
     <w:p>
-      <w:pPr>
-        <w:rPr>
-          <w:rFonts w:hint="eastAsia"/>
-        </w:rPr>
-      </w:pPr>
       <w:r>
         <w:rPr>
           <w:rFonts w:hint="eastAsia"/>
@@ -3240,9 +1444,6 @@
     <w:p>
       <w:pPr>
         <w:pStyle w:val="1"/>
-        <w:rPr>
-          <w:rFonts w:hint="eastAsia"/>
-        </w:rPr>
       </w:pPr>
       <w:r>
         <w:rPr>
@@ -3252,11 +1453,6 @@
       </w:r>
     </w:p>
     <w:p>
-      <w:pPr>
-        <w:rPr>
-          <w:rFonts w:hint="eastAsia"/>
-        </w:rPr>
-      </w:pPr>
       <w:r>
         <w:rPr>
           <w:rFonts w:hint="eastAsia"/>
@@ -3341,7 +1537,6 @@
         <w:keepNext/>
         <w:ind w:firstLine="0"/>
         <w:rPr>
-          <w:rFonts w:hint="eastAsia"/>
           <w:sz w:val="21"/>
         </w:rPr>
       </w:pPr>
@@ -3372,7 +1567,7 @@
           <w:bottom w:w="60" w:type="dxa"/>
           <w:right w:w="80" w:type="dxa"/>
         </w:tblCellMar>
-        <w:tblLook w:val="0000" w:firstRow="0" w:lastRow="0" w:firstColumn="0" w:lastColumn="0" w:noHBand="0" w:noVBand="0"/>
+        <w:tblLook w:val="04A0" w:firstRow="1" w:lastRow="0" w:firstColumn="1" w:lastColumn="0" w:noHBand="0" w:noVBand="1"/>
       </w:tblPr>
       <w:tblGrid>
         <w:gridCol w:w="1660"/>
@@ -5021,11 +3216,6 @@
     </w:tbl>
     <w:p/>
     <w:p>
-      <w:pPr>
-        <w:rPr>
-          <w:rFonts w:hint="eastAsia"/>
-        </w:rPr>
-      </w:pPr>
       <w:r>
         <w:rPr>
           <w:rFonts w:hint="eastAsia"/>
@@ -5118,11 +3308,6 @@
       </w:r>
     </w:p>
     <w:p>
-      <w:pPr>
-        <w:rPr>
-          <w:rFonts w:hint="eastAsia"/>
-        </w:rPr>
-      </w:pPr>
       <w:r>
         <w:rPr>
           <w:rFonts w:hint="eastAsia"/>
@@ -5181,9 +3366,6 @@
     <w:p>
       <w:pPr>
         <w:pStyle w:val="1"/>
-        <w:rPr>
-          <w:rFonts w:hint="eastAsia"/>
-        </w:rPr>
       </w:pPr>
       <w:r>
         <w:rPr>
@@ -5194,11 +3376,6 @@
       </w:r>
     </w:p>
     <w:p>
-      <w:pPr>
-        <w:rPr>
-          <w:rFonts w:hint="eastAsia"/>
-        </w:rPr>
-      </w:pPr>
       <w:r>
         <w:rPr>
           <w:rFonts w:hint="eastAsia"/>
@@ -5279,11 +3456,6 @@
       </w:r>
     </w:p>
     <w:p>
-      <w:pPr>
-        <w:rPr>
-          <w:rFonts w:hint="eastAsia"/>
-        </w:rPr>
-      </w:pPr>
       <w:r>
         <w:rPr>
           <w:rFonts w:hint="eastAsia"/>
@@ -5364,11 +3536,6 @@
       </w:r>
     </w:p>
     <w:p>
-      <w:pPr>
-        <w:rPr>
-          <w:rFonts w:hint="eastAsia"/>
-        </w:rPr>
-      </w:pPr>
       <w:r>
         <w:rPr>
           <w:rFonts w:hint="eastAsia"/>
@@ -5390,12 +3557,8 @@
     </w:p>
     <w:p/>
     <w:sectPr>
-      <w:headerReference w:type="even" r:id="rId6"/>
-      <w:headerReference w:type="default" r:id="rId7"/>
-      <w:footerReference w:type="even" r:id="rId8"/>
-      <w:footerReference w:type="default" r:id="rId9"/>
-      <w:headerReference w:type="first" r:id="rId10"/>
-      <w:footerReference w:type="first" r:id="rId11"/>
+      <w:footerReference w:type="even" r:id="rId7"/>
+      <w:footerReference w:type="default" r:id="rId8"/>
       <w:pgSz w:w="11906" w:h="16838"/>
       <w:pgMar w:top="1440" w:right="1800" w:bottom="1440" w:left="1800" w:header="851" w:footer="992" w:gutter="0"/>
       <w:cols w:space="425"/>
@@ -5434,7 +3597,7 @@
 <w:ftr xmlns:wpc="http://schemas.microsoft.com/office/word/2010/wordprocessingCanvas" xmlns:cx="http://schemas.microsoft.com/office/drawing/2014/chartex" xmlns:cx1="http://schemas.microsoft.com/office/drawing/2015/9/8/chartex" xmlns:cx2="http://schemas.microsoft.com/office/drawing/2015/10/21/chartex" xmlns:cx3="http://schemas.microsoft.com/office/drawing/2016/5/9/chartex" xmlns:cx4="http://schemas.microsoft.com/office/drawing/2016/5/10/chartex" xmlns:cx5="http://schemas.microsoft.com/office/drawing/2016/5/11/chartex" xmlns:cx6="http://schemas.microsoft.com/office/drawing/2016/5/12/chartex" xmlns:cx7="http://schemas.microsoft.com/office/drawing/2016/5/13/chartex" xmlns:cx8="http://schemas.microsoft.com/office/drawing/2016/5/14/chartex" xmlns:mc="http://schemas.openxmlformats.org/markup-compatibility/2006" xmlns:aink="http://schemas.microsoft.com/office/drawing/2016/ink" xmlns:am3d="http://schemas.microsoft.com/office/drawing/2017/model3d" xmlns:o="urn:schemas-microsoft-com:office:office" xmlns:oel="http://schemas.microsoft.com/office/2019/extlst" xmlns:r="http://schemas.openxmlformats.org/officeDocument/2006/relationships" xmlns:m="http://schemas.openxmlformats.org/officeDocument/2006/math" xmlns:v="urn:schemas-microsoft-com:vml" xmlns:wp14="http://schemas.microsoft.com/office/word/2010/wordprocessingDrawing" xmlns:wp="http://schemas.openxmlformats.org/drawingml/2006/wordprocessingDrawing" xmlns:w10="urn:schemas-microsoft-com:office:word" xmlns:w="http://schemas.openxmlformats.org/wordprocessingml/2006/main" xmlns:w14="http://schemas.microsoft.com/office/word/2010/wordml" xmlns:w15="http://schemas.microsoft.com/office/word/2012/wordml" xmlns:w16cex="http://schemas.microsoft.com/office/word/2018/wordml/cex" xmlns:w16cid="http://schemas.microsoft.com/office/word/2016/wordml/cid" xmlns:w16="http://schemas.microsoft.com/office/word/2018/wordml" xmlns:w16du="http://schemas.microsoft.com/office/word/2023/wordml/word16du" xmlns:w16sdtdh="http://schemas.microsoft.com/office/word/2020/wordml/sdtdatahash" xmlns:w16sdtfl="http://schemas.microsoft.com/office/word/2024/wordml/sdtformatlock" xmlns:w16se="http://schemas.microsoft.com/office/word/2015/wordml/symex" xmlns:wpg="http://schemas.microsoft.com/office/word/2010/wordprocessingGroup" xmlns:wpi="http://schemas.microsoft.com/office/word/2010/wordprocessingInk" xmlns:wne="http://schemas.microsoft.com/office/word/2006/wordml" xmlns:wps="http://schemas.microsoft.com/office/word/2010/wordprocessingShape" mc:Ignorable="w14 w15 w16se w16cid w16 w16cex w16sdtdh w16sdtfl w16du wp14">
   <w:p>
     <w:pPr>
-      <w:pStyle w:val="a6"/>
+      <w:pStyle w:val="a3"/>
       <w:framePr w:wrap="around" w:vAnchor="text" w:hAnchor="margin" w:xAlign="center" w:y="1"/>
       <w:rPr>
         <w:rStyle w:val="aa"/>
@@ -5467,7 +3630,7 @@
   </w:p>
   <w:p>
     <w:pPr>
-      <w:pStyle w:val="a6"/>
+      <w:pStyle w:val="a3"/>
     </w:pPr>
   </w:p>
 </w:ftr>
@@ -5477,7 +3640,7 @@
 <w:ftr xmlns:wpc="http://schemas.microsoft.com/office/word/2010/wordprocessingCanvas" xmlns:cx="http://schemas.microsoft.com/office/drawing/2014/chartex" xmlns:cx1="http://schemas.microsoft.com/office/drawing/2015/9/8/chartex" xmlns:cx2="http://schemas.microsoft.com/office/drawing/2015/10/21/chartex" xmlns:cx3="http://schemas.microsoft.com/office/drawing/2016/5/9/chartex" xmlns:cx4="http://schemas.microsoft.com/office/drawing/2016/5/10/chartex" xmlns:cx5="http://schemas.microsoft.com/office/drawing/2016/5/11/chartex" xmlns:cx6="http://schemas.microsoft.com/office/drawing/2016/5/12/chartex" xmlns:cx7="http://schemas.microsoft.com/office/drawing/2016/5/13/chartex" xmlns:cx8="http://schemas.microsoft.com/office/drawing/2016/5/14/chartex" xmlns:mc="http://schemas.openxmlformats.org/markup-compatibility/2006" xmlns:aink="http://schemas.microsoft.com/office/drawing/2016/ink" xmlns:am3d="http://schemas.microsoft.com/office/drawing/2017/model3d" xmlns:o="urn:schemas-microsoft-com:office:office" xmlns:oel="http://schemas.microsoft.com/office/2019/extlst" xmlns:r="http://schemas.openxmlformats.org/officeDocument/2006/relationships" xmlns:m="http://schemas.openxmlformats.org/officeDocument/2006/math" xmlns:v="urn:schemas-microsoft-com:vml" xmlns:wp14="http://schemas.microsoft.com/office/word/2010/wordprocessingDrawing" xmlns:wp="http://schemas.openxmlformats.org/drawingml/2006/wordprocessingDrawing" xmlns:w10="urn:schemas-microsoft-com:office:word" xmlns:w="http://schemas.openxmlformats.org/wordprocessingml/2006/main" xmlns:w14="http://schemas.microsoft.com/office/word/2010/wordml" xmlns:w15="http://schemas.microsoft.com/office/word/2012/wordml" xmlns:w16cex="http://schemas.microsoft.com/office/word/2018/wordml/cex" xmlns:w16cid="http://schemas.microsoft.com/office/word/2016/wordml/cid" xmlns:w16="http://schemas.microsoft.com/office/word/2018/wordml" xmlns:w16du="http://schemas.microsoft.com/office/word/2023/wordml/word16du" xmlns:w16sdtdh="http://schemas.microsoft.com/office/word/2020/wordml/sdtdatahash" xmlns:w16sdtfl="http://schemas.microsoft.com/office/word/2024/wordml/sdtformatlock" xmlns:w16se="http://schemas.microsoft.com/office/word/2015/wordml/symex" xmlns:wpg="http://schemas.microsoft.com/office/word/2010/wordprocessingGroup" xmlns:wpi="http://schemas.microsoft.com/office/word/2010/wordprocessingInk" xmlns:wne="http://schemas.microsoft.com/office/word/2006/wordml" xmlns:wps="http://schemas.microsoft.com/office/word/2010/wordprocessingShape" mc:Ignorable="w14 w15 w16se w16cid w16 w16cex w16sdtdh w16sdtfl w16du wp14">
   <w:p>
     <w:pPr>
-      <w:pStyle w:val="a6"/>
+      <w:pStyle w:val="a3"/>
       <w:framePr w:wrap="around" w:vAnchor="text" w:hAnchor="margin" w:xAlign="center" w:y="1"/>
       <w:rPr>
         <w:rStyle w:val="aa"/>
@@ -5504,7 +3667,6 @@
     <w:r>
       <w:rPr>
         <w:rStyle w:val="aa"/>
-        <w:noProof/>
       </w:rPr>
       <w:t>1</w:t>
     </w:r>
@@ -5517,21 +3679,11 @@
   </w:p>
   <w:p>
     <w:pPr>
-      <w:pStyle w:val="a6"/>
+      <w:pStyle w:val="a3"/>
       <w:jc w:val="center"/>
       <w:rPr>
         <w:sz w:val="21"/>
       </w:rPr>
-    </w:pPr>
-  </w:p>
-</w:ftr>
-</file>
-
-<file path=word/footer3.xml><?xml version="1.0" encoding="utf-8"?>
-<w:ftr xmlns:wpc="http://schemas.microsoft.com/office/word/2010/wordprocessingCanvas" xmlns:cx="http://schemas.microsoft.com/office/drawing/2014/chartex" xmlns:cx1="http://schemas.microsoft.com/office/drawing/2015/9/8/chartex" xmlns:cx2="http://schemas.microsoft.com/office/drawing/2015/10/21/chartex" xmlns:cx3="http://schemas.microsoft.com/office/drawing/2016/5/9/chartex" xmlns:cx4="http://schemas.microsoft.com/office/drawing/2016/5/10/chartex" xmlns:cx5="http://schemas.microsoft.com/office/drawing/2016/5/11/chartex" xmlns:cx6="http://schemas.microsoft.com/office/drawing/2016/5/12/chartex" xmlns:cx7="http://schemas.microsoft.com/office/drawing/2016/5/13/chartex" xmlns:cx8="http://schemas.microsoft.com/office/drawing/2016/5/14/chartex" xmlns:mc="http://schemas.openxmlformats.org/markup-compatibility/2006" xmlns:aink="http://schemas.microsoft.com/office/drawing/2016/ink" xmlns:am3d="http://schemas.microsoft.com/office/drawing/2017/model3d" xmlns:o="urn:schemas-microsoft-com:office:office" xmlns:oel="http://schemas.microsoft.com/office/2019/extlst" xmlns:r="http://schemas.openxmlformats.org/officeDocument/2006/relationships" xmlns:m="http://schemas.openxmlformats.org/officeDocument/2006/math" xmlns:v="urn:schemas-microsoft-com:vml" xmlns:wp14="http://schemas.microsoft.com/office/word/2010/wordprocessingDrawing" xmlns:wp="http://schemas.openxmlformats.org/drawingml/2006/wordprocessingDrawing" xmlns:w10="urn:schemas-microsoft-com:office:word" xmlns:w="http://schemas.openxmlformats.org/wordprocessingml/2006/main" xmlns:w14="http://schemas.microsoft.com/office/word/2010/wordml" xmlns:w15="http://schemas.microsoft.com/office/word/2012/wordml" xmlns:w16cex="http://schemas.microsoft.com/office/word/2018/wordml/cex" xmlns:w16cid="http://schemas.microsoft.com/office/word/2016/wordml/cid" xmlns:w16="http://schemas.microsoft.com/office/word/2018/wordml" xmlns:w16du="http://schemas.microsoft.com/office/word/2023/wordml/word16du" xmlns:w16sdtdh="http://schemas.microsoft.com/office/word/2020/wordml/sdtdatahash" xmlns:w16sdtfl="http://schemas.microsoft.com/office/word/2024/wordml/sdtformatlock" xmlns:w16se="http://schemas.microsoft.com/office/word/2015/wordml/symex" xmlns:wpg="http://schemas.microsoft.com/office/word/2010/wordprocessingGroup" xmlns:wpi="http://schemas.microsoft.com/office/word/2010/wordprocessingInk" xmlns:wne="http://schemas.microsoft.com/office/word/2006/wordml" xmlns:wps="http://schemas.microsoft.com/office/word/2010/wordprocessingShape" mc:Ignorable="w14 w15 w16se w16cid w16 w16cex w16sdtdh w16sdtfl w16du wp14">
-  <w:p>
-    <w:pPr>
-      <w:pStyle w:val="a6"/>
     </w:pPr>
   </w:p>
 </w:ftr>
@@ -5542,7 +3694,7 @@
   <w:footnote w:type="separator" w:id="-1">
     <w:p>
       <w:pPr>
-        <w:spacing w:after="0"/>
+        <w:spacing w:after="0" w:line="240" w:lineRule="auto"/>
       </w:pPr>
       <w:r>
         <w:separator/>
@@ -5552,7 +3704,7 @@
   <w:footnote w:type="continuationSeparator" w:id="0">
     <w:p>
       <w:pPr>
-        <w:spacing w:after="0"/>
+        <w:spacing w:after="0" w:line="240" w:lineRule="auto"/>
       </w:pPr>
       <w:r>
         <w:continuationSeparator/>
@@ -5560,36 +3712,6 @@
     </w:p>
   </w:footnote>
 </w:footnotes>
-</file>
-
-<file path=word/header1.xml><?xml version="1.0" encoding="utf-8"?>
-<w:hdr xmlns:wpc="http://schemas.microsoft.com/office/word/2010/wordprocessingCanvas" xmlns:cx="http://schemas.microsoft.com/office/drawing/2014/chartex" xmlns:cx1="http://schemas.microsoft.com/office/drawing/2015/9/8/chartex" xmlns:cx2="http://schemas.microsoft.com/office/drawing/2015/10/21/chartex" xmlns:cx3="http://schemas.microsoft.com/office/drawing/2016/5/9/chartex" xmlns:cx4="http://schemas.microsoft.com/office/drawing/2016/5/10/chartex" xmlns:cx5="http://schemas.microsoft.com/office/drawing/2016/5/11/chartex" xmlns:cx6="http://schemas.microsoft.com/office/drawing/2016/5/12/chartex" xmlns:cx7="http://schemas.microsoft.com/office/drawing/2016/5/13/chartex" xmlns:cx8="http://schemas.microsoft.com/office/drawing/2016/5/14/chartex" xmlns:mc="http://schemas.openxmlformats.org/markup-compatibility/2006" xmlns:aink="http://schemas.microsoft.com/office/drawing/2016/ink" xmlns:am3d="http://schemas.microsoft.com/office/drawing/2017/model3d" xmlns:o="urn:schemas-microsoft-com:office:office" xmlns:oel="http://schemas.microsoft.com/office/2019/extlst" xmlns:r="http://schemas.openxmlformats.org/officeDocument/2006/relationships" xmlns:m="http://schemas.openxmlformats.org/officeDocument/2006/math" xmlns:v="urn:schemas-microsoft-com:vml" xmlns:wp14="http://schemas.microsoft.com/office/word/2010/wordprocessingDrawing" xmlns:wp="http://schemas.openxmlformats.org/drawingml/2006/wordprocessingDrawing" xmlns:w10="urn:schemas-microsoft-com:office:word" xmlns:w="http://schemas.openxmlformats.org/wordprocessingml/2006/main" xmlns:w14="http://schemas.microsoft.com/office/word/2010/wordml" xmlns:w15="http://schemas.microsoft.com/office/word/2012/wordml" xmlns:w16cex="http://schemas.microsoft.com/office/word/2018/wordml/cex" xmlns:w16cid="http://schemas.microsoft.com/office/word/2016/wordml/cid" xmlns:w16="http://schemas.microsoft.com/office/word/2018/wordml" xmlns:w16du="http://schemas.microsoft.com/office/word/2023/wordml/word16du" xmlns:w16sdtdh="http://schemas.microsoft.com/office/word/2020/wordml/sdtdatahash" xmlns:w16sdtfl="http://schemas.microsoft.com/office/word/2024/wordml/sdtformatlock" xmlns:w16se="http://schemas.microsoft.com/office/word/2015/wordml/symex" xmlns:wpg="http://schemas.microsoft.com/office/word/2010/wordprocessingGroup" xmlns:wpi="http://schemas.microsoft.com/office/word/2010/wordprocessingInk" xmlns:wne="http://schemas.microsoft.com/office/word/2006/wordml" xmlns:wps="http://schemas.microsoft.com/office/word/2010/wordprocessingShape" mc:Ignorable="w14 w15 w16se w16cid w16 w16cex w16sdtdh w16sdtfl w16du wp14">
-  <w:p>
-    <w:pPr>
-      <w:pStyle w:val="a4"/>
-    </w:pPr>
-  </w:p>
-</w:hdr>
-</file>
-
-<file path=word/header2.xml><?xml version="1.0" encoding="utf-8"?>
-<w:hdr xmlns:wpc="http://schemas.microsoft.com/office/word/2010/wordprocessingCanvas" xmlns:cx="http://schemas.microsoft.com/office/drawing/2014/chartex" xmlns:cx1="http://schemas.microsoft.com/office/drawing/2015/9/8/chartex" xmlns:cx2="http://schemas.microsoft.com/office/drawing/2015/10/21/chartex" xmlns:cx3="http://schemas.microsoft.com/office/drawing/2016/5/9/chartex" xmlns:cx4="http://schemas.microsoft.com/office/drawing/2016/5/10/chartex" xmlns:cx5="http://schemas.microsoft.com/office/drawing/2016/5/11/chartex" xmlns:cx6="http://schemas.microsoft.com/office/drawing/2016/5/12/chartex" xmlns:cx7="http://schemas.microsoft.com/office/drawing/2016/5/13/chartex" xmlns:cx8="http://schemas.microsoft.com/office/drawing/2016/5/14/chartex" xmlns:mc="http://schemas.openxmlformats.org/markup-compatibility/2006" xmlns:aink="http://schemas.microsoft.com/office/drawing/2016/ink" xmlns:am3d="http://schemas.microsoft.com/office/drawing/2017/model3d" xmlns:o="urn:schemas-microsoft-com:office:office" xmlns:oel="http://schemas.microsoft.com/office/2019/extlst" xmlns:r="http://schemas.openxmlformats.org/officeDocument/2006/relationships" xmlns:m="http://schemas.openxmlformats.org/officeDocument/2006/math" xmlns:v="urn:schemas-microsoft-com:vml" xmlns:wp14="http://schemas.microsoft.com/office/word/2010/wordprocessingDrawing" xmlns:wp="http://schemas.openxmlformats.org/drawingml/2006/wordprocessingDrawing" xmlns:w10="urn:schemas-microsoft-com:office:word" xmlns:w="http://schemas.openxmlformats.org/wordprocessingml/2006/main" xmlns:w14="http://schemas.microsoft.com/office/word/2010/wordml" xmlns:w15="http://schemas.microsoft.com/office/word/2012/wordml" xmlns:w16cex="http://schemas.microsoft.com/office/word/2018/wordml/cex" xmlns:w16cid="http://schemas.microsoft.com/office/word/2016/wordml/cid" xmlns:w16="http://schemas.microsoft.com/office/word/2018/wordml" xmlns:w16du="http://schemas.microsoft.com/office/word/2023/wordml/word16du" xmlns:w16sdtdh="http://schemas.microsoft.com/office/word/2020/wordml/sdtdatahash" xmlns:w16sdtfl="http://schemas.microsoft.com/office/word/2024/wordml/sdtformatlock" xmlns:w16se="http://schemas.microsoft.com/office/word/2015/wordml/symex" xmlns:wpg="http://schemas.microsoft.com/office/word/2010/wordprocessingGroup" xmlns:wpi="http://schemas.microsoft.com/office/word/2010/wordprocessingInk" xmlns:wne="http://schemas.microsoft.com/office/word/2006/wordml" xmlns:wps="http://schemas.microsoft.com/office/word/2010/wordprocessingShape" mc:Ignorable="w14 w15 w16se w16cid w16 w16cex w16sdtdh w16sdtfl w16du wp14">
-  <w:p>
-    <w:pPr>
-      <w:pStyle w:val="a4"/>
-    </w:pPr>
-  </w:p>
-</w:hdr>
-</file>
-
-<file path=word/header3.xml><?xml version="1.0" encoding="utf-8"?>
-<w:hdr xmlns:wpc="http://schemas.microsoft.com/office/word/2010/wordprocessingCanvas" xmlns:cx="http://schemas.microsoft.com/office/drawing/2014/chartex" xmlns:cx1="http://schemas.microsoft.com/office/drawing/2015/9/8/chartex" xmlns:cx2="http://schemas.microsoft.com/office/drawing/2015/10/21/chartex" xmlns:cx3="http://schemas.microsoft.com/office/drawing/2016/5/9/chartex" xmlns:cx4="http://schemas.microsoft.com/office/drawing/2016/5/10/chartex" xmlns:cx5="http://schemas.microsoft.com/office/drawing/2016/5/11/chartex" xmlns:cx6="http://schemas.microsoft.com/office/drawing/2016/5/12/chartex" xmlns:cx7="http://schemas.microsoft.com/office/drawing/2016/5/13/chartex" xmlns:cx8="http://schemas.microsoft.com/office/drawing/2016/5/14/chartex" xmlns:mc="http://schemas.openxmlformats.org/markup-compatibility/2006" xmlns:aink="http://schemas.microsoft.com/office/drawing/2016/ink" xmlns:am3d="http://schemas.microsoft.com/office/drawing/2017/model3d" xmlns:o="urn:schemas-microsoft-com:office:office" xmlns:oel="http://schemas.microsoft.com/office/2019/extlst" xmlns:r="http://schemas.openxmlformats.org/officeDocument/2006/relationships" xmlns:m="http://schemas.openxmlformats.org/officeDocument/2006/math" xmlns:v="urn:schemas-microsoft-com:vml" xmlns:wp14="http://schemas.microsoft.com/office/word/2010/wordprocessingDrawing" xmlns:wp="http://schemas.openxmlformats.org/drawingml/2006/wordprocessingDrawing" xmlns:w10="urn:schemas-microsoft-com:office:word" xmlns:w="http://schemas.openxmlformats.org/wordprocessingml/2006/main" xmlns:w14="http://schemas.microsoft.com/office/word/2010/wordml" xmlns:w15="http://schemas.microsoft.com/office/word/2012/wordml" xmlns:w16cex="http://schemas.microsoft.com/office/word/2018/wordml/cex" xmlns:w16cid="http://schemas.microsoft.com/office/word/2016/wordml/cid" xmlns:w16="http://schemas.microsoft.com/office/word/2018/wordml" xmlns:w16du="http://schemas.microsoft.com/office/word/2023/wordml/word16du" xmlns:w16sdtdh="http://schemas.microsoft.com/office/word/2020/wordml/sdtdatahash" xmlns:w16sdtfl="http://schemas.microsoft.com/office/word/2024/wordml/sdtformatlock" xmlns:w16se="http://schemas.microsoft.com/office/word/2015/wordml/symex" xmlns:wpg="http://schemas.microsoft.com/office/word/2010/wordprocessingGroup" xmlns:wpi="http://schemas.microsoft.com/office/word/2010/wordprocessingInk" xmlns:wne="http://schemas.microsoft.com/office/word/2006/wordml" xmlns:wps="http://schemas.microsoft.com/office/word/2010/wordprocessingShape" mc:Ignorable="w14 w15 w16se w16cid w16 w16cex w16sdtdh w16sdtfl w16du wp14">
-  <w:p>
-    <w:pPr>
-      <w:pStyle w:val="a4"/>
-    </w:pPr>
-  </w:p>
-</w:hdr>
 </file>
 
 <file path=word/styles.xml><?xml version="1.0" encoding="utf-8"?>
@@ -5614,15 +3736,17 @@
     <w:lsdException w:name="heading 7" w:semiHidden="1" w:unhideWhenUsed="1" w:qFormat="1"/>
     <w:lsdException w:name="heading 8" w:semiHidden="1" w:unhideWhenUsed="1" w:qFormat="1"/>
     <w:lsdException w:name="heading 9" w:semiHidden="1" w:unhideWhenUsed="1" w:qFormat="1"/>
+    <w:lsdException w:name="footer" w:qFormat="1"/>
     <w:lsdException w:name="caption" w:semiHidden="1" w:unhideWhenUsed="1" w:qFormat="1"/>
+    <w:lsdException w:name="page number" w:qFormat="1"/>
     <w:lsdException w:name="Title" w:qFormat="1"/>
-    <w:lsdException w:name="Default Paragraph Font" w:semiHidden="1" w:qFormat="1"/>
+    <w:lsdException w:name="Default Paragraph Font" w:semiHidden="1" w:uiPriority="1" w:unhideWhenUsed="1" w:qFormat="1"/>
     <w:lsdException w:name="Subtitle" w:qFormat="1"/>
     <w:lsdException w:name="Strong" w:qFormat="1"/>
     <w:lsdException w:name="Emphasis" w:qFormat="1"/>
     <w:lsdException w:name="HTML Top of Form" w:semiHidden="1" w:uiPriority="99" w:unhideWhenUsed="1"/>
     <w:lsdException w:name="HTML Bottom of Form" w:semiHidden="1" w:uiPriority="99" w:unhideWhenUsed="1"/>
-    <w:lsdException w:name="Normal Table" w:semiHidden="1" w:unhideWhenUsed="1" w:qFormat="1"/>
+    <w:lsdException w:name="Normal Table" w:semiHidden="1" w:uiPriority="99" w:unhideWhenUsed="1" w:qFormat="1"/>
     <w:lsdException w:name="No List" w:semiHidden="1" w:uiPriority="99" w:unhideWhenUsed="1"/>
     <w:lsdException w:name="Outline List 1" w:semiHidden="1" w:uiPriority="99" w:unhideWhenUsed="1"/>
     <w:lsdException w:name="Outline List 2" w:semiHidden="1" w:uiPriority="99" w:unhideWhenUsed="1"/>
@@ -5936,7 +4060,6 @@
     <w:semiHidden/>
     <w:unhideWhenUsed/>
     <w:qFormat/>
-    <w:rsid w:val="00621BE0"/>
     <w:pPr>
       <w:keepNext/>
       <w:keepLines/>
@@ -5978,27 +4101,28 @@
     <w:semiHidden/>
     <w:unhideWhenUsed/>
   </w:style>
-  <w:style w:type="table" w:styleId="a3">
-    <w:name w:val="Table Grid"/>
-    <w:basedOn w:val="a1"/>
-    <w:uiPriority w:val="59"/>
+  <w:style w:type="paragraph" w:styleId="a3">
+    <w:name w:val="footer"/>
+    <w:basedOn w:val="a"/>
+    <w:link w:val="a4"/>
     <w:qFormat/>
-    <w:tblPr>
-      <w:tblBorders>
-        <w:top w:val="single" w:sz="4" w:space="0" w:color="auto"/>
-        <w:left w:val="single" w:sz="4" w:space="0" w:color="auto"/>
-        <w:bottom w:val="single" w:sz="4" w:space="0" w:color="auto"/>
-        <w:right w:val="single" w:sz="4" w:space="0" w:color="auto"/>
-        <w:insideH w:val="single" w:sz="4" w:space="0" w:color="auto"/>
-        <w:insideV w:val="single" w:sz="4" w:space="0" w:color="auto"/>
-      </w:tblBorders>
-    </w:tblPr>
+    <w:pPr>
+      <w:tabs>
+        <w:tab w:val="center" w:pos="4153"/>
+        <w:tab w:val="right" w:pos="8306"/>
+      </w:tabs>
+      <w:snapToGrid w:val="0"/>
+      <w:spacing w:line="240" w:lineRule="auto"/>
+    </w:pPr>
+    <w:rPr>
+      <w:sz w:val="18"/>
+      <w:szCs w:val="18"/>
+    </w:rPr>
   </w:style>
-  <w:style w:type="paragraph" w:styleId="a4">
+  <w:style w:type="paragraph" w:styleId="a5">
     <w:name w:val="header"/>
     <w:basedOn w:val="a"/>
-    <w:link w:val="a5"/>
-    <w:rsid w:val="00621BE0"/>
+    <w:link w:val="a6"/>
     <w:pPr>
       <w:tabs>
         <w:tab w:val="center" w:pos="4153"/>
@@ -6013,73 +4137,12 @@
       <w:szCs w:val="18"/>
     </w:rPr>
   </w:style>
-  <w:style w:type="character" w:customStyle="1" w:styleId="a5">
-    <w:name w:val="页眉 字符"/>
-    <w:basedOn w:val="a0"/>
-    <w:link w:val="a4"/>
-    <w:rsid w:val="00621BE0"/>
-    <w:rPr>
-      <w:rFonts w:ascii="Calibri" w:eastAsia="宋体" w:hAnsi="Calibri"/>
-      <w:color w:val="202020"/>
-      <w:sz w:val="18"/>
-      <w:szCs w:val="18"/>
-      <w:lang w:eastAsia="en-US"/>
-    </w:rPr>
-  </w:style>
-  <w:style w:type="paragraph" w:styleId="a6">
-    <w:name w:val="footer"/>
-    <w:basedOn w:val="a"/>
-    <w:link w:val="a7"/>
-    <w:rsid w:val="00621BE0"/>
-    <w:pPr>
-      <w:tabs>
-        <w:tab w:val="center" w:pos="4153"/>
-        <w:tab w:val="right" w:pos="8306"/>
-      </w:tabs>
-      <w:snapToGrid w:val="0"/>
-      <w:spacing w:line="240" w:lineRule="auto"/>
-    </w:pPr>
-    <w:rPr>
-      <w:sz w:val="18"/>
-      <w:szCs w:val="18"/>
-    </w:rPr>
-  </w:style>
-  <w:style w:type="character" w:customStyle="1" w:styleId="a7">
-    <w:name w:val="页脚 字符"/>
-    <w:basedOn w:val="a0"/>
-    <w:link w:val="a6"/>
-    <w:rsid w:val="00621BE0"/>
-    <w:rPr>
-      <w:rFonts w:ascii="Calibri" w:eastAsia="宋体" w:hAnsi="Calibri"/>
-      <w:color w:val="202020"/>
-      <w:sz w:val="18"/>
-      <w:szCs w:val="18"/>
-      <w:lang w:eastAsia="en-US"/>
-    </w:rPr>
-  </w:style>
-  <w:style w:type="character" w:customStyle="1" w:styleId="20">
-    <w:name w:val="标题 2 字符"/>
-    <w:basedOn w:val="a0"/>
-    <w:link w:val="2"/>
-    <w:semiHidden/>
-    <w:rsid w:val="00621BE0"/>
-    <w:rPr>
-      <w:rFonts w:ascii="Arial" w:eastAsia="黑体" w:hAnsi="Arial" w:cs="Arial"/>
-      <w:b/>
-      <w:bCs/>
-      <w:color w:val="000000"/>
-      <w:sz w:val="24"/>
-      <w:szCs w:val="32"/>
-      <w:lang w:eastAsia="en-US"/>
-    </w:rPr>
-  </w:style>
-  <w:style w:type="paragraph" w:styleId="a8">
+  <w:style w:type="paragraph" w:styleId="a7">
     <w:name w:val="Title"/>
     <w:basedOn w:val="a"/>
     <w:next w:val="a"/>
-    <w:link w:val="a9"/>
+    <w:link w:val="a8"/>
     <w:qFormat/>
-    <w:rsid w:val="00621BE0"/>
     <w:pPr>
       <w:keepNext/>
       <w:keepLines/>
@@ -6096,11 +4159,74 @@
       <w:szCs w:val="32"/>
     </w:rPr>
   </w:style>
-  <w:style w:type="character" w:customStyle="1" w:styleId="a9">
+  <w:style w:type="table" w:styleId="a9">
+    <w:name w:val="Table Grid"/>
+    <w:basedOn w:val="a1"/>
+    <w:uiPriority w:val="59"/>
+    <w:qFormat/>
+    <w:tblPr>
+      <w:tblBorders>
+        <w:top w:val="single" w:sz="4" w:space="0" w:color="auto"/>
+        <w:left w:val="single" w:sz="4" w:space="0" w:color="auto"/>
+        <w:bottom w:val="single" w:sz="4" w:space="0" w:color="auto"/>
+        <w:right w:val="single" w:sz="4" w:space="0" w:color="auto"/>
+        <w:insideH w:val="single" w:sz="4" w:space="0" w:color="auto"/>
+        <w:insideV w:val="single" w:sz="4" w:space="0" w:color="auto"/>
+      </w:tblBorders>
+    </w:tblPr>
+  </w:style>
+  <w:style w:type="character" w:styleId="aa">
+    <w:name w:val="page number"/>
+    <w:basedOn w:val="a0"/>
+    <w:qFormat/>
+  </w:style>
+  <w:style w:type="character" w:customStyle="1" w:styleId="a6">
+    <w:name w:val="页眉 字符"/>
+    <w:basedOn w:val="a0"/>
+    <w:link w:val="a5"/>
+    <w:qFormat/>
+    <w:rPr>
+      <w:rFonts w:ascii="Calibri" w:eastAsia="宋体" w:hAnsi="Calibri"/>
+      <w:color w:val="202020"/>
+      <w:sz w:val="18"/>
+      <w:szCs w:val="18"/>
+      <w:lang w:eastAsia="en-US"/>
+    </w:rPr>
+  </w:style>
+  <w:style w:type="character" w:customStyle="1" w:styleId="a4">
+    <w:name w:val="页脚 字符"/>
+    <w:basedOn w:val="a0"/>
+    <w:link w:val="a3"/>
+    <w:qFormat/>
+    <w:rPr>
+      <w:rFonts w:ascii="Calibri" w:eastAsia="宋体" w:hAnsi="Calibri"/>
+      <w:color w:val="202020"/>
+      <w:sz w:val="18"/>
+      <w:szCs w:val="18"/>
+      <w:lang w:eastAsia="en-US"/>
+    </w:rPr>
+  </w:style>
+  <w:style w:type="character" w:customStyle="1" w:styleId="20">
+    <w:name w:val="标题 2 字符"/>
+    <w:basedOn w:val="a0"/>
+    <w:link w:val="2"/>
+    <w:semiHidden/>
+    <w:qFormat/>
+    <w:rPr>
+      <w:rFonts w:ascii="Arial" w:eastAsia="黑体" w:hAnsi="Arial" w:cs="Arial"/>
+      <w:b/>
+      <w:bCs/>
+      <w:color w:val="000000"/>
+      <w:sz w:val="24"/>
+      <w:szCs w:val="32"/>
+      <w:lang w:eastAsia="en-US"/>
+    </w:rPr>
+  </w:style>
+  <w:style w:type="character" w:customStyle="1" w:styleId="a8">
     <w:name w:val="标题 字符"/>
     <w:basedOn w:val="a0"/>
-    <w:link w:val="a8"/>
-    <w:rsid w:val="00621BE0"/>
+    <w:link w:val="a7"/>
+    <w:qFormat/>
     <w:rPr>
       <w:rFonts w:ascii="Arial" w:eastAsia="黑体" w:hAnsi="Arial" w:cs="Arial"/>
       <w:b/>
@@ -6110,11 +4236,6 @@
       <w:szCs w:val="32"/>
       <w:lang w:eastAsia="en-US"/>
     </w:rPr>
-  </w:style>
-  <w:style w:type="character" w:styleId="aa">
-    <w:name w:val="page number"/>
-    <w:basedOn w:val="a0"/>
-    <w:rsid w:val="00621BE0"/>
   </w:style>
 </w:styles>
 </file>

</xml_diff>